<commit_message>
Parcial practico primer corte
</commit_message>
<xml_diff>
--- a/Implementacion de patrones - Johan Calderon.docx
+++ b/Implementacion de patrones - Johan Calderon.docx
@@ -853,7 +853,7 @@
                                         <w:szCs w:val="40"/>
                                         <w:lang w:val="es-ES"/>
                                       </w:rPr>
-                                      <w:t>7</w:t>
+                                      <w:t>14</w:t>
                                     </w:r>
                                     <w:r>
                                       <w:rPr>
@@ -932,7 +932,7 @@
                                   <w:szCs w:val="40"/>
                                   <w:lang w:val="es-ES"/>
                                 </w:rPr>
-                                <w:t>7</w:t>
+                                <w:t>14</w:t>
                               </w:r>
                               <w:r>
                                 <w:rPr>
@@ -1120,6 +1120,10 @@
     <w:sdt>
       <w:sdtPr>
         <w:rPr>
+          <w:rFonts w:ascii="Arial" w:eastAsia="Times New Roman" w:hAnsi="Arial" w:cs="Times New Roman"/>
+          <w:color w:val="auto"/>
+          <w:sz w:val="24"/>
+          <w:szCs w:val="24"/>
           <w:lang w:val="es-ES"/>
         </w:rPr>
         <w:id w:val="-1125543329"/>
@@ -1130,12 +1134,8 @@
       </w:sdtPr>
       <w:sdtEndPr>
         <w:rPr>
-          <w:rFonts w:ascii="Arial" w:eastAsia="Times New Roman" w:hAnsi="Arial" w:cs="Times New Roman"/>
           <w:b/>
           <w:bCs/>
-          <w:color w:val="auto"/>
-          <w:sz w:val="24"/>
-          <w:szCs w:val="24"/>
         </w:rPr>
       </w:sdtEndPr>
       <w:sdtContent>
@@ -1195,7 +1195,7 @@
           <w:r>
             <w:fldChar w:fldCharType="separate"/>
           </w:r>
-          <w:hyperlink w:anchor="_Toc223788643" w:history="1">
+          <w:hyperlink w:anchor="_Toc224386484" w:history="1">
             <w:r>
               <w:rPr>
                 <w:rStyle w:val="Hipervnculo"/>
@@ -1238,7 +1238,7 @@
                 <w:noProof/>
                 <w:webHidden/>
               </w:rPr>
-              <w:instrText xml:space="preserve"> PAGEREF _Toc223788643 \h </w:instrText>
+              <w:instrText xml:space="preserve"> PAGEREF _Toc224386484 \h </w:instrText>
             </w:r>
             <w:r>
               <w:rPr>
@@ -1282,7 +1282,7 @@
               <w:szCs w:val="22"/>
             </w:rPr>
           </w:pPr>
-          <w:hyperlink w:anchor="_Toc223788644" w:history="1">
+          <w:hyperlink w:anchor="_Toc224386485" w:history="1">
             <w:r>
               <w:rPr>
                 <w:rStyle w:val="Hipervnculo"/>
@@ -1325,7 +1325,7 @@
                 <w:noProof/>
                 <w:webHidden/>
               </w:rPr>
-              <w:instrText xml:space="preserve"> PAGEREF _Toc223788644 \h </w:instrText>
+              <w:instrText xml:space="preserve"> PAGEREF _Toc224386485 \h </w:instrText>
             </w:r>
             <w:r>
               <w:rPr>
@@ -1369,7 +1369,7 @@
               <w:szCs w:val="22"/>
             </w:rPr>
           </w:pPr>
-          <w:hyperlink w:anchor="_Toc223788645" w:history="1">
+          <w:hyperlink w:anchor="_Toc224386486" w:history="1">
             <w:r>
               <w:rPr>
                 <w:rStyle w:val="Hipervnculo"/>
@@ -1413,7 +1413,7 @@
                 <w:noProof/>
                 <w:webHidden/>
               </w:rPr>
-              <w:instrText xml:space="preserve"> PAGEREF _Toc223788645 \h </w:instrText>
+              <w:instrText xml:space="preserve"> PAGEREF _Toc224386486 \h </w:instrText>
             </w:r>
             <w:r>
               <w:rPr>
@@ -1457,7 +1457,7 @@
               <w:szCs w:val="22"/>
             </w:rPr>
           </w:pPr>
-          <w:hyperlink w:anchor="_Toc223788646" w:history="1">
+          <w:hyperlink w:anchor="_Toc224386487" w:history="1">
             <w:r>
               <w:rPr>
                 <w:rStyle w:val="Hipervnculo"/>
@@ -1501,7 +1501,7 @@
                 <w:noProof/>
                 <w:webHidden/>
               </w:rPr>
-              <w:instrText xml:space="preserve"> PAGEREF _Toc223788646 \h </w:instrText>
+              <w:instrText xml:space="preserve"> PAGEREF _Toc224386487 \h </w:instrText>
             </w:r>
             <w:r>
               <w:rPr>
@@ -1545,7 +1545,7 @@
               <w:szCs w:val="22"/>
             </w:rPr>
           </w:pPr>
-          <w:hyperlink w:anchor="_Toc223788647" w:history="1">
+          <w:hyperlink w:anchor="_Toc224386488" w:history="1">
             <w:r>
               <w:rPr>
                 <w:rStyle w:val="Hipervnculo"/>
@@ -1588,7 +1588,7 @@
                 <w:noProof/>
                 <w:webHidden/>
               </w:rPr>
-              <w:instrText xml:space="preserve"> PAGEREF _Toc223788647 \h </w:instrText>
+              <w:instrText xml:space="preserve"> PAGEREF _Toc224386488 \h </w:instrText>
             </w:r>
             <w:r>
               <w:rPr>
@@ -1632,7 +1632,7 @@
               <w:szCs w:val="22"/>
             </w:rPr>
           </w:pPr>
-          <w:hyperlink w:anchor="_Toc223788648" w:history="1">
+          <w:hyperlink w:anchor="_Toc224386489" w:history="1">
             <w:r>
               <w:rPr>
                 <w:rStyle w:val="Hipervnculo"/>
@@ -1675,7 +1675,7 @@
                 <w:noProof/>
                 <w:webHidden/>
               </w:rPr>
-              <w:instrText xml:space="preserve"> PAGEREF _Toc223788648 \h </w:instrText>
+              <w:instrText xml:space="preserve"> PAGEREF _Toc224386489 \h </w:instrText>
             </w:r>
             <w:r>
               <w:rPr>
@@ -1719,7 +1719,7 @@
               <w:szCs w:val="22"/>
             </w:rPr>
           </w:pPr>
-          <w:hyperlink w:anchor="_Toc223788649" w:history="1">
+          <w:hyperlink w:anchor="_Toc224386490" w:history="1">
             <w:r>
               <w:rPr>
                 <w:rStyle w:val="Hipervnculo"/>
@@ -1763,7 +1763,7 @@
                 <w:noProof/>
                 <w:webHidden/>
               </w:rPr>
-              <w:instrText xml:space="preserve"> PAGEREF _Toc223788649 \h </w:instrText>
+              <w:instrText xml:space="preserve"> PAGEREF _Toc224386490 \h </w:instrText>
             </w:r>
             <w:r>
               <w:rPr>
@@ -1807,7 +1807,7 @@
               <w:szCs w:val="22"/>
             </w:rPr>
           </w:pPr>
-          <w:hyperlink w:anchor="_Toc223788650" w:history="1">
+          <w:hyperlink w:anchor="_Toc224386491" w:history="1">
             <w:r>
               <w:rPr>
                 <w:rStyle w:val="Hipervnculo"/>
@@ -1851,7 +1851,7 @@
                 <w:noProof/>
                 <w:webHidden/>
               </w:rPr>
-              <w:instrText xml:space="preserve"> PAGEREF _Toc223788650 \h </w:instrText>
+              <w:instrText xml:space="preserve"> PAGEREF _Toc224386491 \h </w:instrText>
             </w:r>
             <w:r>
               <w:rPr>
@@ -1895,7 +1895,7 @@
               <w:szCs w:val="22"/>
             </w:rPr>
           </w:pPr>
-          <w:hyperlink w:anchor="_Toc223788651" w:history="1">
+          <w:hyperlink w:anchor="_Toc224386492" w:history="1">
             <w:r>
               <w:rPr>
                 <w:rStyle w:val="Hipervnculo"/>
@@ -1938,7 +1938,7 @@
                 <w:noProof/>
                 <w:webHidden/>
               </w:rPr>
-              <w:instrText xml:space="preserve"> PAGEREF _Toc223788651 \h </w:instrText>
+              <w:instrText xml:space="preserve"> PAGEREF _Toc224386492 \h </w:instrText>
             </w:r>
             <w:r>
               <w:rPr>
@@ -1982,7 +1982,7 @@
               <w:szCs w:val="22"/>
             </w:rPr>
           </w:pPr>
-          <w:hyperlink w:anchor="_Toc223788652" w:history="1">
+          <w:hyperlink w:anchor="_Toc224386493" w:history="1">
             <w:r>
               <w:rPr>
                 <w:rStyle w:val="Hipervnculo"/>
@@ -2025,7 +2025,7 @@
                 <w:noProof/>
                 <w:webHidden/>
               </w:rPr>
-              <w:instrText xml:space="preserve"> PAGEREF _Toc223788652 \h </w:instrText>
+              <w:instrText xml:space="preserve"> PAGEREF _Toc224386493 \h </w:instrText>
             </w:r>
             <w:r>
               <w:rPr>
@@ -2069,7 +2069,7 @@
               <w:szCs w:val="22"/>
             </w:rPr>
           </w:pPr>
-          <w:hyperlink w:anchor="_Toc223788653" w:history="1">
+          <w:hyperlink w:anchor="_Toc224386494" w:history="1">
             <w:r>
               <w:rPr>
                 <w:rStyle w:val="Hipervnculo"/>
@@ -2113,7 +2113,7 @@
                 <w:noProof/>
                 <w:webHidden/>
               </w:rPr>
-              <w:instrText xml:space="preserve"> PAGEREF _Toc223788653 \h </w:instrText>
+              <w:instrText xml:space="preserve"> PAGEREF _Toc224386494 \h </w:instrText>
             </w:r>
             <w:r>
               <w:rPr>
@@ -2157,7 +2157,7 @@
               <w:szCs w:val="22"/>
             </w:rPr>
           </w:pPr>
-          <w:hyperlink w:anchor="_Toc223788654" w:history="1">
+          <w:hyperlink w:anchor="_Toc224386495" w:history="1">
             <w:r>
               <w:rPr>
                 <w:rStyle w:val="Hipervnculo"/>
@@ -2201,7 +2201,7 @@
                 <w:noProof/>
                 <w:webHidden/>
               </w:rPr>
-              <w:instrText xml:space="preserve"> PAGEREF _Toc223788654 \h </w:instrText>
+              <w:instrText xml:space="preserve"> PAGEREF _Toc224386495 \h </w:instrText>
             </w:r>
             <w:r>
               <w:rPr>
@@ -2233,6 +2233,336 @@
           </w:hyperlink>
         </w:p>
         <w:p>
+          <w:pPr>
+            <w:pStyle w:val="TDC1"/>
+            <w:tabs>
+              <w:tab w:val="left" w:pos="440"/>
+            </w:tabs>
+            <w:rPr>
+              <w:rFonts w:asciiTheme="minorHAnsi" w:eastAsiaTheme="minorEastAsia" w:hAnsiTheme="minorHAnsi" w:cstheme="minorBidi"/>
+              <w:noProof/>
+              <w:sz w:val="22"/>
+              <w:szCs w:val="22"/>
+            </w:rPr>
+          </w:pPr>
+          <w:hyperlink w:anchor="_Toc224386496" w:history="1">
+            <w:r>
+              <w:rPr>
+                <w:rStyle w:val="Hipervnculo"/>
+                <w:noProof/>
+              </w:rPr>
+              <w:t>4.</w:t>
+            </w:r>
+            <w:r>
+              <w:rPr>
+                <w:rFonts w:asciiTheme="minorHAnsi" w:eastAsiaTheme="minorEastAsia" w:hAnsiTheme="minorHAnsi" w:cstheme="minorBidi"/>
+                <w:noProof/>
+                <w:sz w:val="22"/>
+                <w:szCs w:val="22"/>
+              </w:rPr>
+              <w:tab/>
+            </w:r>
+            <w:r>
+              <w:rPr>
+                <w:rStyle w:val="Hipervnculo"/>
+                <w:noProof/>
+              </w:rPr>
+              <w:t>Patrón Builder</w:t>
+            </w:r>
+            <w:r>
+              <w:rPr>
+                <w:noProof/>
+                <w:webHidden/>
+              </w:rPr>
+              <w:tab/>
+            </w:r>
+            <w:r>
+              <w:rPr>
+                <w:noProof/>
+                <w:webHidden/>
+              </w:rPr>
+              <w:fldChar w:fldCharType="begin"/>
+            </w:r>
+            <w:r>
+              <w:rPr>
+                <w:noProof/>
+                <w:webHidden/>
+              </w:rPr>
+              <w:instrText xml:space="preserve"> PAGEREF _Toc224386496 \h </w:instrText>
+            </w:r>
+            <w:r>
+              <w:rPr>
+                <w:noProof/>
+                <w:webHidden/>
+              </w:rPr>
+            </w:r>
+            <w:r>
+              <w:rPr>
+                <w:noProof/>
+                <w:webHidden/>
+              </w:rPr>
+              <w:fldChar w:fldCharType="separate"/>
+            </w:r>
+            <w:r>
+              <w:rPr>
+                <w:noProof/>
+                <w:webHidden/>
+              </w:rPr>
+              <w:t>13</w:t>
+            </w:r>
+            <w:r>
+              <w:rPr>
+                <w:noProof/>
+                <w:webHidden/>
+              </w:rPr>
+              <w:fldChar w:fldCharType="end"/>
+            </w:r>
+          </w:hyperlink>
+        </w:p>
+        <w:p>
+          <w:pPr>
+            <w:pStyle w:val="TDC1"/>
+            <w:tabs>
+              <w:tab w:val="left" w:pos="660"/>
+            </w:tabs>
+            <w:rPr>
+              <w:rFonts w:asciiTheme="minorHAnsi" w:eastAsiaTheme="minorEastAsia" w:hAnsiTheme="minorHAnsi" w:cstheme="minorBidi"/>
+              <w:noProof/>
+              <w:sz w:val="22"/>
+              <w:szCs w:val="22"/>
+            </w:rPr>
+          </w:pPr>
+          <w:hyperlink w:anchor="_Toc224386497" w:history="1">
+            <w:r>
+              <w:rPr>
+                <w:rStyle w:val="Hipervnculo"/>
+                <w:noProof/>
+              </w:rPr>
+              <w:t>4.1.</w:t>
+            </w:r>
+            <w:r>
+              <w:rPr>
+                <w:rFonts w:asciiTheme="minorHAnsi" w:eastAsiaTheme="minorEastAsia" w:hAnsiTheme="minorHAnsi" w:cstheme="minorBidi"/>
+                <w:noProof/>
+                <w:sz w:val="22"/>
+                <w:szCs w:val="22"/>
+              </w:rPr>
+              <w:tab/>
+            </w:r>
+            <w:r>
+              <w:rPr>
+                <w:rStyle w:val="Hipervnculo"/>
+                <w:noProof/>
+              </w:rPr>
+              <w:t>Análisis para la aplicación del Builder</w:t>
+            </w:r>
+            <w:r>
+              <w:rPr>
+                <w:noProof/>
+                <w:webHidden/>
+              </w:rPr>
+              <w:tab/>
+            </w:r>
+            <w:r>
+              <w:rPr>
+                <w:noProof/>
+                <w:webHidden/>
+              </w:rPr>
+              <w:fldChar w:fldCharType="begin"/>
+            </w:r>
+            <w:r>
+              <w:rPr>
+                <w:noProof/>
+                <w:webHidden/>
+              </w:rPr>
+              <w:instrText xml:space="preserve"> PAGEREF _Toc224386497 \h </w:instrText>
+            </w:r>
+            <w:r>
+              <w:rPr>
+                <w:noProof/>
+                <w:webHidden/>
+              </w:rPr>
+            </w:r>
+            <w:r>
+              <w:rPr>
+                <w:noProof/>
+                <w:webHidden/>
+              </w:rPr>
+              <w:fldChar w:fldCharType="separate"/>
+            </w:r>
+            <w:r>
+              <w:rPr>
+                <w:noProof/>
+                <w:webHidden/>
+              </w:rPr>
+              <w:t>13</w:t>
+            </w:r>
+            <w:r>
+              <w:rPr>
+                <w:noProof/>
+                <w:webHidden/>
+              </w:rPr>
+              <w:fldChar w:fldCharType="end"/>
+            </w:r>
+          </w:hyperlink>
+        </w:p>
+        <w:p>
+          <w:pPr>
+            <w:pStyle w:val="TDC1"/>
+            <w:tabs>
+              <w:tab w:val="left" w:pos="660"/>
+            </w:tabs>
+            <w:rPr>
+              <w:rFonts w:asciiTheme="minorHAnsi" w:eastAsiaTheme="minorEastAsia" w:hAnsiTheme="minorHAnsi" w:cstheme="minorBidi"/>
+              <w:noProof/>
+              <w:sz w:val="22"/>
+              <w:szCs w:val="22"/>
+            </w:rPr>
+          </w:pPr>
+          <w:hyperlink w:anchor="_Toc224386498" w:history="1">
+            <w:r>
+              <w:rPr>
+                <w:rStyle w:val="Hipervnculo"/>
+                <w:rFonts w:cs="Arial"/>
+                <w:noProof/>
+              </w:rPr>
+              <w:t>4.2.</w:t>
+            </w:r>
+            <w:r>
+              <w:rPr>
+                <w:rFonts w:asciiTheme="minorHAnsi" w:eastAsiaTheme="minorEastAsia" w:hAnsiTheme="minorHAnsi" w:cstheme="minorBidi"/>
+                <w:noProof/>
+                <w:sz w:val="22"/>
+                <w:szCs w:val="22"/>
+              </w:rPr>
+              <w:tab/>
+            </w:r>
+            <w:r>
+              <w:rPr>
+                <w:rStyle w:val="Hipervnculo"/>
+                <w:noProof/>
+              </w:rPr>
+              <w:t>Aplicación del patrón Builder</w:t>
+            </w:r>
+            <w:r>
+              <w:rPr>
+                <w:noProof/>
+                <w:webHidden/>
+              </w:rPr>
+              <w:tab/>
+            </w:r>
+            <w:r>
+              <w:rPr>
+                <w:noProof/>
+                <w:webHidden/>
+              </w:rPr>
+              <w:fldChar w:fldCharType="begin"/>
+            </w:r>
+            <w:r>
+              <w:rPr>
+                <w:noProof/>
+                <w:webHidden/>
+              </w:rPr>
+              <w:instrText xml:space="preserve"> PAGEREF _Toc224386498 \h </w:instrText>
+            </w:r>
+            <w:r>
+              <w:rPr>
+                <w:noProof/>
+                <w:webHidden/>
+              </w:rPr>
+            </w:r>
+            <w:r>
+              <w:rPr>
+                <w:noProof/>
+                <w:webHidden/>
+              </w:rPr>
+              <w:fldChar w:fldCharType="separate"/>
+            </w:r>
+            <w:r>
+              <w:rPr>
+                <w:noProof/>
+                <w:webHidden/>
+              </w:rPr>
+              <w:t>14</w:t>
+            </w:r>
+            <w:r>
+              <w:rPr>
+                <w:noProof/>
+                <w:webHidden/>
+              </w:rPr>
+              <w:fldChar w:fldCharType="end"/>
+            </w:r>
+          </w:hyperlink>
+        </w:p>
+        <w:p>
+          <w:pPr>
+            <w:pStyle w:val="TDC1"/>
+            <w:rPr>
+              <w:rFonts w:asciiTheme="minorHAnsi" w:eastAsiaTheme="minorEastAsia" w:hAnsiTheme="minorHAnsi" w:cstheme="minorBidi"/>
+              <w:noProof/>
+              <w:sz w:val="22"/>
+              <w:szCs w:val="22"/>
+            </w:rPr>
+          </w:pPr>
+          <w:hyperlink w:anchor="_Toc224386499" w:history="1">
+            <w:r>
+              <w:rPr>
+                <w:rStyle w:val="Hipervnculo"/>
+                <w:noProof/>
+              </w:rPr>
+              <w:t>4.3. Diagrama UML</w:t>
+            </w:r>
+            <w:r>
+              <w:rPr>
+                <w:noProof/>
+                <w:webHidden/>
+              </w:rPr>
+              <w:tab/>
+            </w:r>
+            <w:r>
+              <w:rPr>
+                <w:noProof/>
+                <w:webHidden/>
+              </w:rPr>
+              <w:fldChar w:fldCharType="begin"/>
+            </w:r>
+            <w:r>
+              <w:rPr>
+                <w:noProof/>
+                <w:webHidden/>
+              </w:rPr>
+              <w:instrText xml:space="preserve"> PAGEREF _Toc224386499 \h </w:instrText>
+            </w:r>
+            <w:r>
+              <w:rPr>
+                <w:noProof/>
+                <w:webHidden/>
+              </w:rPr>
+            </w:r>
+            <w:r>
+              <w:rPr>
+                <w:noProof/>
+                <w:webHidden/>
+              </w:rPr>
+              <w:fldChar w:fldCharType="separate"/>
+            </w:r>
+            <w:r>
+              <w:rPr>
+                <w:noProof/>
+                <w:webHidden/>
+              </w:rPr>
+              <w:t>15</w:t>
+            </w:r>
+            <w:r>
+              <w:rPr>
+                <w:noProof/>
+                <w:webHidden/>
+              </w:rPr>
+              <w:fldChar w:fldCharType="end"/>
+            </w:r>
+          </w:hyperlink>
+        </w:p>
+        <w:p>
           <w:r>
             <w:rPr>
               <w:b/>
@@ -2366,42 +2696,6 @@
     </w:p>
     <w:p>
       <w:pPr>
-        <w:spacing w:before="100" w:beforeAutospacing="1" w:after="100" w:afterAutospacing="1"/>
-        <w:outlineLvl w:val="0"/>
-        <w:rPr>
-          <w:rFonts w:cs="Arial"/>
-          <w:b/>
-          <w:bCs/>
-          <w:kern w:val="36"/>
-        </w:rPr>
-      </w:pPr>
-    </w:p>
-    <w:p>
-      <w:pPr>
-        <w:spacing w:before="100" w:beforeAutospacing="1" w:after="100" w:afterAutospacing="1"/>
-        <w:outlineLvl w:val="0"/>
-        <w:rPr>
-          <w:rFonts w:cs="Arial"/>
-          <w:b/>
-          <w:bCs/>
-          <w:kern w:val="36"/>
-        </w:rPr>
-      </w:pPr>
-    </w:p>
-    <w:p>
-      <w:pPr>
-        <w:spacing w:before="100" w:beforeAutospacing="1" w:after="100" w:afterAutospacing="1"/>
-        <w:outlineLvl w:val="0"/>
-        <w:rPr>
-          <w:rFonts w:cs="Arial"/>
-          <w:b/>
-          <w:bCs/>
-          <w:kern w:val="36"/>
-        </w:rPr>
-      </w:pPr>
-    </w:p>
-    <w:p>
-      <w:pPr>
         <w:pStyle w:val="Ttulo1"/>
         <w:numPr>
           <w:ilvl w:val="0"/>
@@ -2409,7 +2703,7 @@
         </w:numPr>
         <w:spacing w:line="480" w:lineRule="auto"/>
       </w:pPr>
-      <w:bookmarkStart w:id="0" w:name="_Toc223788643"/>
+      <w:bookmarkStart w:id="0" w:name="_Toc224386484"/>
       <w:r>
         <w:lastRenderedPageBreak/>
         <w:t>Patrón Singleton</w:t>
@@ -2424,7 +2718,7 @@
           <w:numId w:val="19"/>
         </w:numPr>
       </w:pPr>
-      <w:bookmarkStart w:id="1" w:name="_Toc223788644"/>
+      <w:bookmarkStart w:id="1" w:name="_Toc224386485"/>
       <w:r>
         <w:t>Análisis para la aplicación del Singleton</w:t>
       </w:r>
@@ -2559,7 +2853,7 @@
           <w:szCs w:val="24"/>
         </w:rPr>
       </w:pPr>
-      <w:bookmarkStart w:id="2" w:name="_Toc223788645"/>
+      <w:bookmarkStart w:id="2" w:name="_Toc224386486"/>
       <w:r>
         <w:t>Aplicación del patrón Singleton</w:t>
       </w:r>
@@ -6418,7 +6712,7 @@
           <w:szCs w:val="24"/>
         </w:rPr>
       </w:pPr>
-      <w:bookmarkStart w:id="3" w:name="_Toc223788646"/>
+      <w:bookmarkStart w:id="3" w:name="_Toc224386487"/>
       <w:r>
         <w:lastRenderedPageBreak/>
         <w:t>Diagrama UML</w:t>
@@ -6503,12 +6797,9 @@
         </w:numPr>
         <w:spacing w:line="480" w:lineRule="auto"/>
       </w:pPr>
-      <w:bookmarkStart w:id="4" w:name="_Toc223788647"/>
-      <w:r>
-        <w:t xml:space="preserve">Patrón </w:t>
-      </w:r>
-      <w:r>
-        <w:t>Factory Method</w:t>
+      <w:bookmarkStart w:id="4" w:name="_Toc224386488"/>
+      <w:r>
+        <w:t>Patrón Factory Method</w:t>
       </w:r>
       <w:bookmarkEnd w:id="4"/>
     </w:p>
@@ -6520,12 +6811,9 @@
           <w:numId w:val="19"/>
         </w:numPr>
       </w:pPr>
-      <w:bookmarkStart w:id="5" w:name="_Toc223788648"/>
-      <w:r>
-        <w:t xml:space="preserve">Análisis para la aplicación del </w:t>
-      </w:r>
-      <w:r>
-        <w:t>Factory Method</w:t>
+      <w:bookmarkStart w:id="5" w:name="_Toc224386489"/>
+      <w:r>
+        <w:t>Análisis para la aplicación del Factory Method</w:t>
       </w:r>
       <w:bookmarkEnd w:id="5"/>
     </w:p>
@@ -6557,14 +6845,7 @@
           <w:rFonts w:cs="Arial"/>
           <w:szCs w:val="24"/>
         </w:rPr>
-        <w:t xml:space="preserve"> </w:t>
-      </w:r>
-      <w:r>
-        <w:rPr>
-          <w:rFonts w:cs="Arial"/>
-          <w:szCs w:val="24"/>
-        </w:rPr>
-        <w:t>definir una interfaz para crear objetos en una superclase, delegando la instanciación específica a subclases.</w:t>
+        <w:t xml:space="preserve"> definir una interfaz para crear objetos en una superclase, delegando la instanciación específica a subclases.</w:t>
       </w:r>
     </w:p>
     <w:p>
@@ -6663,12 +6944,9 @@
           <w:szCs w:val="24"/>
         </w:rPr>
       </w:pPr>
-      <w:bookmarkStart w:id="6" w:name="_Toc223788649"/>
-      <w:r>
-        <w:t xml:space="preserve">Aplicación del patrón </w:t>
-      </w:r>
-      <w:r>
-        <w:t>Factory Method</w:t>
+      <w:bookmarkStart w:id="6" w:name="_Toc224386490"/>
+      <w:r>
+        <w:t>Aplicación del patrón Factory Method</w:t>
       </w:r>
       <w:bookmarkEnd w:id="6"/>
     </w:p>
@@ -16762,7 +17040,7 @@
           <w:szCs w:val="24"/>
         </w:rPr>
       </w:pPr>
-      <w:bookmarkStart w:id="7" w:name="_Toc223788650"/>
+      <w:bookmarkStart w:id="7" w:name="_Toc224386491"/>
       <w:r>
         <w:t>Diagrama UML</w:t>
       </w:r>
@@ -16838,16 +17116,10 @@
         </w:numPr>
         <w:spacing w:line="480" w:lineRule="auto"/>
       </w:pPr>
-      <w:bookmarkStart w:id="8" w:name="_Toc223788651"/>
+      <w:bookmarkStart w:id="8" w:name="_Toc224386492"/>
       <w:r>
         <w:lastRenderedPageBreak/>
-        <w:t xml:space="preserve">Patrón </w:t>
-      </w:r>
-      <w:r>
-        <w:t xml:space="preserve">Abstract </w:t>
-      </w:r>
-      <w:r>
-        <w:t>Factory</w:t>
+        <w:t>Patrón Abstract Factory</w:t>
       </w:r>
       <w:bookmarkEnd w:id="8"/>
     </w:p>
@@ -16859,7 +17131,7 @@
           <w:numId w:val="19"/>
         </w:numPr>
       </w:pPr>
-      <w:bookmarkStart w:id="9" w:name="_Toc223788652"/>
+      <w:bookmarkStart w:id="9" w:name="_Toc224386493"/>
       <w:r>
         <w:t xml:space="preserve">Análisis para la aplicación del </w:t>
       </w:r>
@@ -17143,7 +17415,7 @@
           <w:szCs w:val="24"/>
         </w:rPr>
       </w:pPr>
-      <w:bookmarkStart w:id="10" w:name="_Toc223788653"/>
+      <w:bookmarkStart w:id="10" w:name="_Toc224386494"/>
       <w:r>
         <w:t xml:space="preserve">Aplicación del patrón </w:t>
       </w:r>
@@ -22503,22 +22775,13 @@
       </w:r>
       <w:proofErr w:type="spellEnd"/>
       <w:r>
-        <w:t xml:space="preserve"> selecciona una fábrica </w:t>
-      </w:r>
-      <w:r>
-        <w:t>concreta,</w:t>
+        <w:t xml:space="preserve"> selecciona una fábrica concreta,</w:t>
       </w:r>
       <w:r>
         <w:t xml:space="preserve"> </w:t>
       </w:r>
       <w:r>
-        <w:t xml:space="preserve">por </w:t>
-      </w:r>
-      <w:r>
-        <w:t>ejemplo,</w:t>
-      </w:r>
-      <w:r>
-        <w:t xml:space="preserve"> </w:t>
+        <w:t xml:space="preserve">por ejemplo, </w:t>
       </w:r>
       <w:proofErr w:type="spellStart"/>
       <w:r>
@@ -22644,7 +22907,7 @@
           <w:szCs w:val="24"/>
         </w:rPr>
       </w:pPr>
-      <w:bookmarkStart w:id="11" w:name="_Toc223788654"/>
+      <w:bookmarkStart w:id="11" w:name="_Toc224386495"/>
       <w:r>
         <w:lastRenderedPageBreak/>
         <w:t>Diagrama UML</w:t>
@@ -22713,8 +22976,2623 @@
         </w:drawing>
       </w:r>
     </w:p>
+    <w:p>
+      <w:pPr>
+        <w:rPr>
+          <w:rFonts w:ascii="Consolas" w:hAnsi="Consolas"/>
+          <w:sz w:val="21"/>
+          <w:szCs w:val="21"/>
+        </w:rPr>
+      </w:pPr>
+    </w:p>
+    <w:p>
+      <w:pPr>
+        <w:rPr>
+          <w:rFonts w:ascii="Consolas" w:hAnsi="Consolas"/>
+          <w:sz w:val="21"/>
+          <w:szCs w:val="21"/>
+        </w:rPr>
+      </w:pPr>
+    </w:p>
+    <w:p>
+      <w:pPr>
+        <w:pStyle w:val="Ttulo1"/>
+        <w:numPr>
+          <w:ilvl w:val="0"/>
+          <w:numId w:val="19"/>
+        </w:numPr>
+        <w:spacing w:line="480" w:lineRule="auto"/>
+      </w:pPr>
+      <w:bookmarkStart w:id="12" w:name="_Toc224386496"/>
+      <w:r>
+        <w:t xml:space="preserve">Patrón </w:t>
+      </w:r>
+      <w:proofErr w:type="spellStart"/>
+      <w:r>
+        <w:t>Builder</w:t>
+      </w:r>
+      <w:bookmarkEnd w:id="12"/>
+      <w:proofErr w:type="spellEnd"/>
+    </w:p>
+    <w:p>
+      <w:pPr>
+        <w:pStyle w:val="Ttulo1"/>
+        <w:numPr>
+          <w:ilvl w:val="1"/>
+          <w:numId w:val="19"/>
+        </w:numPr>
+      </w:pPr>
+      <w:bookmarkStart w:id="13" w:name="_Toc224386497"/>
+      <w:r>
+        <w:t xml:space="preserve">Análisis para la aplicación del </w:t>
+      </w:r>
+      <w:proofErr w:type="spellStart"/>
+      <w:r>
+        <w:t>Builder</w:t>
+      </w:r>
+      <w:bookmarkEnd w:id="13"/>
+      <w:proofErr w:type="spellEnd"/>
+    </w:p>
+    <w:p>
+      <w:pPr>
+        <w:pStyle w:val="Prrafodelista"/>
+        <w:numPr>
+          <w:ilvl w:val="0"/>
+          <w:numId w:val="20"/>
+        </w:numPr>
+        <w:spacing w:line="480" w:lineRule="auto"/>
+        <w:jc w:val="both"/>
+        <w:rPr>
+          <w:rFonts w:cs="Arial"/>
+          <w:szCs w:val="24"/>
+        </w:rPr>
+      </w:pPr>
+      <w:r>
+        <w:rPr>
+          <w:rFonts w:cs="Arial"/>
+          <w:b/>
+          <w:bCs/>
+          <w:szCs w:val="24"/>
+        </w:rPr>
+        <w:t>Objetivo del patrón:</w:t>
+      </w:r>
+      <w:r>
+        <w:rPr>
+          <w:rFonts w:cs="Arial"/>
+          <w:szCs w:val="24"/>
+        </w:rPr>
+        <w:t xml:space="preserve"> </w:t>
+      </w:r>
+      <w:r>
+        <w:t>Permitir construir objetos complejos paso a paso con una API clara y fluida, evitando constructores largos o confusos.</w:t>
+      </w:r>
+    </w:p>
+    <w:p>
+      <w:pPr>
+        <w:pStyle w:val="Prrafodelista"/>
+        <w:spacing w:line="480" w:lineRule="auto"/>
+        <w:ind w:left="1068"/>
+        <w:jc w:val="both"/>
+        <w:rPr>
+          <w:rFonts w:cs="Arial"/>
+          <w:szCs w:val="24"/>
+        </w:rPr>
+      </w:pPr>
+    </w:p>
+    <w:p>
+      <w:pPr>
+        <w:pStyle w:val="Prrafodelista"/>
+        <w:numPr>
+          <w:ilvl w:val="0"/>
+          <w:numId w:val="20"/>
+        </w:numPr>
+        <w:spacing w:line="480" w:lineRule="auto"/>
+        <w:jc w:val="both"/>
+        <w:rPr>
+          <w:rFonts w:cs="Arial"/>
+          <w:szCs w:val="24"/>
+        </w:rPr>
+      </w:pPr>
+      <w:r>
+        <w:rPr>
+          <w:rFonts w:cs="Arial"/>
+          <w:b/>
+          <w:bCs/>
+          <w:szCs w:val="24"/>
+        </w:rPr>
+        <w:t>Motivación en el proyecto:</w:t>
+      </w:r>
+      <w:r>
+        <w:rPr>
+          <w:rFonts w:cs="Arial"/>
+          <w:szCs w:val="24"/>
+        </w:rPr>
+        <w:t xml:space="preserve"> la </w:t>
+      </w:r>
+      <w:proofErr w:type="spellStart"/>
+      <w:r>
+        <w:t>La</w:t>
+      </w:r>
+      <w:proofErr w:type="spellEnd"/>
+      <w:r>
+        <w:t xml:space="preserve"> entidad </w:t>
+      </w:r>
+      <w:proofErr w:type="spellStart"/>
+      <w:r>
+        <w:rPr>
+          <w:b/>
+          <w:bCs/>
+        </w:rPr>
+        <w:t>Prescription</w:t>
+      </w:r>
+      <w:proofErr w:type="spellEnd"/>
+      <w:r>
+        <w:t xml:space="preserve"> (y también </w:t>
+      </w:r>
+      <w:proofErr w:type="spellStart"/>
+      <w:r>
+        <w:rPr>
+          <w:b/>
+          <w:bCs/>
+        </w:rPr>
+        <w:t>Observation</w:t>
+      </w:r>
+      <w:proofErr w:type="spellEnd"/>
+      <w:r>
+        <w:t xml:space="preserve">) puede tener muchos campos opcionales: paciente, medicamento, dosis, código, fecha inicio/fin, creador, frecuencia, etc. Usar múltiples constructores o </w:t>
+      </w:r>
+      <w:proofErr w:type="spellStart"/>
+      <w:r>
+        <w:t>setear</w:t>
+      </w:r>
+      <w:proofErr w:type="spellEnd"/>
+      <w:r>
+        <w:t xml:space="preserve"> campo por campo en diferentes lugares causa errores, código desordenado y </w:t>
+      </w:r>
+      <w:proofErr w:type="spellStart"/>
+      <w:r>
+        <w:t>tests</w:t>
+      </w:r>
+      <w:proofErr w:type="spellEnd"/>
+      <w:r>
+        <w:t xml:space="preserve"> frágiles. Con </w:t>
+      </w:r>
+      <w:proofErr w:type="spellStart"/>
+      <w:r>
+        <w:rPr>
+          <w:b/>
+          <w:bCs/>
+        </w:rPr>
+        <w:t>Builder</w:t>
+      </w:r>
+      <w:r>
+        <w:t>:</w:t>
+      </w:r>
+      <w:proofErr w:type="spellEnd"/>
+    </w:p>
+    <w:p>
+      <w:pPr>
+        <w:pStyle w:val="Prrafodelista"/>
+      </w:pPr>
+    </w:p>
+    <w:p>
+      <w:pPr>
+        <w:pStyle w:val="Prrafodelista"/>
+        <w:numPr>
+          <w:ilvl w:val="1"/>
+          <w:numId w:val="20"/>
+        </w:numPr>
+        <w:spacing w:line="480" w:lineRule="auto"/>
+        <w:jc w:val="both"/>
+        <w:rPr>
+          <w:rFonts w:cs="Arial"/>
+          <w:szCs w:val="24"/>
+        </w:rPr>
+      </w:pPr>
+      <w:r>
+        <w:t>C</w:t>
+      </w:r>
+      <w:r>
+        <w:t xml:space="preserve">reas la </w:t>
+      </w:r>
+      <w:proofErr w:type="spellStart"/>
+      <w:r>
+        <w:rPr>
+          <w:b/>
+          <w:bCs/>
+        </w:rPr>
+        <w:t>Prescription</w:t>
+      </w:r>
+      <w:proofErr w:type="spellEnd"/>
+      <w:r>
+        <w:t xml:space="preserve"> con una sintaxis fluida</w:t>
+      </w:r>
+    </w:p>
+    <w:p>
+      <w:pPr>
+        <w:pStyle w:val="Prrafodelista"/>
+        <w:numPr>
+          <w:ilvl w:val="1"/>
+          <w:numId w:val="20"/>
+        </w:numPr>
+        <w:spacing w:line="480" w:lineRule="auto"/>
+        <w:jc w:val="both"/>
+        <w:rPr>
+          <w:rFonts w:cs="Arial"/>
+          <w:szCs w:val="24"/>
+        </w:rPr>
+      </w:pPr>
+      <w:r>
+        <w:t>C</w:t>
+      </w:r>
+      <w:r>
+        <w:t xml:space="preserve">entralizas valores por defecto y validaciones (por </w:t>
+      </w:r>
+      <w:proofErr w:type="gramStart"/>
+      <w:r>
+        <w:t>ejemplo</w:t>
+      </w:r>
+      <w:proofErr w:type="gramEnd"/>
+      <w:r>
+        <w:t xml:space="preserve"> </w:t>
+      </w:r>
+      <w:proofErr w:type="spellStart"/>
+      <w:r>
+        <w:rPr>
+          <w:b/>
+          <w:bCs/>
+        </w:rPr>
+        <w:t>startDate</w:t>
+      </w:r>
+      <w:proofErr w:type="spellEnd"/>
+      <w:r>
+        <w:t xml:space="preserve"> si no viene)</w:t>
+      </w:r>
+    </w:p>
+    <w:p>
+      <w:pPr>
+        <w:pStyle w:val="Prrafodelista"/>
+        <w:numPr>
+          <w:ilvl w:val="1"/>
+          <w:numId w:val="20"/>
+        </w:numPr>
+        <w:spacing w:line="480" w:lineRule="auto"/>
+        <w:jc w:val="both"/>
+        <w:rPr>
+          <w:rFonts w:cs="Arial"/>
+          <w:szCs w:val="24"/>
+        </w:rPr>
+      </w:pPr>
+      <w:r>
+        <w:t>E</w:t>
+      </w:r>
+      <w:r>
+        <w:t xml:space="preserve">l código de </w:t>
+      </w:r>
+      <w:proofErr w:type="spellStart"/>
+      <w:r>
+        <w:t>controller</w:t>
+      </w:r>
+      <w:proofErr w:type="spellEnd"/>
+      <w:r>
+        <w:t>/</w:t>
+      </w:r>
+      <w:proofErr w:type="spellStart"/>
+      <w:r>
+        <w:t>service</w:t>
+      </w:r>
+      <w:proofErr w:type="spellEnd"/>
+      <w:r>
+        <w:t xml:space="preserve"> queda más limpio y fácil de leer</w:t>
+      </w:r>
+    </w:p>
+    <w:p>
+      <w:pPr>
+        <w:spacing w:line="480" w:lineRule="auto"/>
+        <w:jc w:val="both"/>
+        <w:rPr>
+          <w:rFonts w:cs="Arial"/>
+        </w:rPr>
+      </w:pPr>
+    </w:p>
+    <w:p>
+      <w:pPr>
+        <w:pStyle w:val="Ttulo1"/>
+        <w:numPr>
+          <w:ilvl w:val="1"/>
+          <w:numId w:val="19"/>
+        </w:numPr>
+        <w:spacing w:line="480" w:lineRule="auto"/>
+        <w:jc w:val="both"/>
+        <w:rPr>
+          <w:rFonts w:cs="Arial"/>
+          <w:szCs w:val="24"/>
+        </w:rPr>
+      </w:pPr>
+      <w:bookmarkStart w:id="14" w:name="_Toc224386498"/>
+      <w:r>
+        <w:lastRenderedPageBreak/>
+        <w:t xml:space="preserve">Aplicación del patrón </w:t>
+      </w:r>
+      <w:proofErr w:type="spellStart"/>
+      <w:r>
+        <w:t>Builder</w:t>
+      </w:r>
+      <w:bookmarkEnd w:id="14"/>
+      <w:proofErr w:type="spellEnd"/>
+    </w:p>
+    <w:p>
+      <w:pPr>
+        <w:pStyle w:val="Prrafodelista"/>
+        <w:numPr>
+          <w:ilvl w:val="0"/>
+          <w:numId w:val="19"/>
+        </w:numPr>
+        <w:shd w:val="clear" w:color="auto" w:fill="1F1F1F"/>
+        <w:spacing w:line="285" w:lineRule="atLeast"/>
+        <w:rPr>
+          <w:rFonts w:ascii="Consolas" w:hAnsi="Consolas"/>
+          <w:color w:val="CCCCCC"/>
+          <w:sz w:val="21"/>
+          <w:szCs w:val="21"/>
+        </w:rPr>
+      </w:pPr>
+      <w:r>
+        <w:rPr>
+          <w:rFonts w:ascii="Consolas" w:hAnsi="Consolas"/>
+          <w:color w:val="CCCCCC"/>
+          <w:sz w:val="21"/>
+          <w:szCs w:val="21"/>
+        </w:rPr>
+        <w:t>@</w:t>
+      </w:r>
+      <w:r>
+        <w:rPr>
+          <w:rFonts w:ascii="Consolas" w:hAnsi="Consolas"/>
+          <w:color w:val="4EC9B0"/>
+          <w:sz w:val="21"/>
+          <w:szCs w:val="21"/>
+        </w:rPr>
+        <w:t>RestController</w:t>
+      </w:r>
+    </w:p>
+    <w:p>
+      <w:pPr>
+        <w:pStyle w:val="Prrafodelista"/>
+        <w:numPr>
+          <w:ilvl w:val="0"/>
+          <w:numId w:val="19"/>
+        </w:numPr>
+        <w:shd w:val="clear" w:color="auto" w:fill="1F1F1F"/>
+        <w:spacing w:line="285" w:lineRule="atLeast"/>
+        <w:rPr>
+          <w:rFonts w:ascii="Consolas" w:hAnsi="Consolas"/>
+          <w:color w:val="CCCCCC"/>
+          <w:sz w:val="21"/>
+          <w:szCs w:val="21"/>
+        </w:rPr>
+      </w:pPr>
+      <w:r>
+        <w:rPr>
+          <w:rFonts w:ascii="Consolas" w:hAnsi="Consolas"/>
+          <w:color w:val="CCCCCC"/>
+          <w:sz w:val="21"/>
+          <w:szCs w:val="21"/>
+        </w:rPr>
+        <w:t>@</w:t>
+      </w:r>
+      <w:r>
+        <w:rPr>
+          <w:rFonts w:ascii="Consolas" w:hAnsi="Consolas"/>
+          <w:color w:val="4EC9B0"/>
+          <w:sz w:val="21"/>
+          <w:szCs w:val="21"/>
+        </w:rPr>
+        <w:t>RequestMapping</w:t>
+      </w:r>
+      <w:r>
+        <w:rPr>
+          <w:rFonts w:ascii="Consolas" w:hAnsi="Consolas"/>
+          <w:color w:val="CCCCCC"/>
+          <w:sz w:val="21"/>
+          <w:szCs w:val="21"/>
+        </w:rPr>
+        <w:t>(</w:t>
+      </w:r>
+      <w:r>
+        <w:rPr>
+          <w:rFonts w:ascii="Consolas" w:hAnsi="Consolas"/>
+          <w:color w:val="CE9178"/>
+          <w:sz w:val="21"/>
+          <w:szCs w:val="21"/>
+        </w:rPr>
+        <w:t>"/api/test"</w:t>
+      </w:r>
+      <w:r>
+        <w:rPr>
+          <w:rFonts w:ascii="Consolas" w:hAnsi="Consolas"/>
+          <w:color w:val="CCCCCC"/>
+          <w:sz w:val="21"/>
+          <w:szCs w:val="21"/>
+        </w:rPr>
+        <w:t>)</w:t>
+      </w:r>
+    </w:p>
+    <w:p>
+      <w:pPr>
+        <w:pStyle w:val="Prrafodelista"/>
+        <w:numPr>
+          <w:ilvl w:val="0"/>
+          <w:numId w:val="19"/>
+        </w:numPr>
+        <w:shd w:val="clear" w:color="auto" w:fill="1F1F1F"/>
+        <w:spacing w:line="285" w:lineRule="atLeast"/>
+        <w:rPr>
+          <w:rFonts w:ascii="Consolas" w:hAnsi="Consolas"/>
+          <w:color w:val="CCCCCC"/>
+          <w:sz w:val="21"/>
+          <w:szCs w:val="21"/>
+        </w:rPr>
+      </w:pPr>
+      <w:r>
+        <w:rPr>
+          <w:rFonts w:ascii="Consolas" w:hAnsi="Consolas"/>
+          <w:color w:val="569CD6"/>
+          <w:sz w:val="21"/>
+          <w:szCs w:val="21"/>
+        </w:rPr>
+        <w:t>public</w:t>
+      </w:r>
+      <w:r>
+        <w:rPr>
+          <w:rFonts w:ascii="Consolas" w:hAnsi="Consolas"/>
+          <w:color w:val="CCCCCC"/>
+          <w:sz w:val="21"/>
+          <w:szCs w:val="21"/>
+        </w:rPr>
+        <w:t xml:space="preserve"> </w:t>
+      </w:r>
+      <w:r>
+        <w:rPr>
+          <w:rFonts w:ascii="Consolas" w:hAnsi="Consolas"/>
+          <w:color w:val="569CD6"/>
+          <w:sz w:val="21"/>
+          <w:szCs w:val="21"/>
+        </w:rPr>
+        <w:t>class</w:t>
+      </w:r>
+      <w:r>
+        <w:rPr>
+          <w:rFonts w:ascii="Consolas" w:hAnsi="Consolas"/>
+          <w:color w:val="CCCCCC"/>
+          <w:sz w:val="21"/>
+          <w:szCs w:val="21"/>
+        </w:rPr>
+        <w:t xml:space="preserve"> </w:t>
+      </w:r>
+      <w:proofErr w:type="spellStart"/>
+      <w:r>
+        <w:rPr>
+          <w:rFonts w:ascii="Consolas" w:hAnsi="Consolas"/>
+          <w:color w:val="4EC9B0"/>
+          <w:sz w:val="21"/>
+          <w:szCs w:val="21"/>
+        </w:rPr>
+        <w:t>TestBuilderController</w:t>
+      </w:r>
+      <w:proofErr w:type="spellEnd"/>
+      <w:r>
+        <w:rPr>
+          <w:rFonts w:ascii="Consolas" w:hAnsi="Consolas"/>
+          <w:color w:val="CCCCCC"/>
+          <w:sz w:val="21"/>
+          <w:szCs w:val="21"/>
+        </w:rPr>
+        <w:t xml:space="preserve"> {</w:t>
+      </w:r>
+    </w:p>
+    <w:p>
+      <w:pPr>
+        <w:pStyle w:val="Prrafodelista"/>
+        <w:numPr>
+          <w:ilvl w:val="0"/>
+          <w:numId w:val="19"/>
+        </w:numPr>
+        <w:shd w:val="clear" w:color="auto" w:fill="1F1F1F"/>
+        <w:spacing w:line="285" w:lineRule="atLeast"/>
+        <w:rPr>
+          <w:rFonts w:ascii="Consolas" w:hAnsi="Consolas"/>
+          <w:color w:val="CCCCCC"/>
+          <w:sz w:val="21"/>
+          <w:szCs w:val="21"/>
+        </w:rPr>
+      </w:pPr>
+    </w:p>
+    <w:p>
+      <w:pPr>
+        <w:pStyle w:val="Prrafodelista"/>
+        <w:numPr>
+          <w:ilvl w:val="0"/>
+          <w:numId w:val="19"/>
+        </w:numPr>
+        <w:shd w:val="clear" w:color="auto" w:fill="1F1F1F"/>
+        <w:spacing w:line="285" w:lineRule="atLeast"/>
+        <w:rPr>
+          <w:rFonts w:ascii="Consolas" w:hAnsi="Consolas"/>
+          <w:color w:val="CCCCCC"/>
+          <w:sz w:val="21"/>
+          <w:szCs w:val="21"/>
+        </w:rPr>
+      </w:pPr>
+      <w:r>
+        <w:rPr>
+          <w:rFonts w:ascii="Consolas" w:hAnsi="Consolas"/>
+          <w:color w:val="CCCCCC"/>
+          <w:sz w:val="21"/>
+          <w:szCs w:val="21"/>
+        </w:rPr>
+        <w:t xml:space="preserve">    </w:t>
+      </w:r>
+      <w:r>
+        <w:rPr>
+          <w:rFonts w:ascii="Consolas" w:hAnsi="Consolas"/>
+          <w:color w:val="569CD6"/>
+          <w:sz w:val="21"/>
+          <w:szCs w:val="21"/>
+        </w:rPr>
+        <w:t>private</w:t>
+      </w:r>
+      <w:r>
+        <w:rPr>
+          <w:rFonts w:ascii="Consolas" w:hAnsi="Consolas"/>
+          <w:color w:val="CCCCCC"/>
+          <w:sz w:val="21"/>
+          <w:szCs w:val="21"/>
+        </w:rPr>
+        <w:t xml:space="preserve"> </w:t>
+      </w:r>
+      <w:r>
+        <w:rPr>
+          <w:rFonts w:ascii="Consolas" w:hAnsi="Consolas"/>
+          <w:color w:val="569CD6"/>
+          <w:sz w:val="21"/>
+          <w:szCs w:val="21"/>
+        </w:rPr>
+        <w:t>final</w:t>
+      </w:r>
+      <w:r>
+        <w:rPr>
+          <w:rFonts w:ascii="Consolas" w:hAnsi="Consolas"/>
+          <w:color w:val="CCCCCC"/>
+          <w:sz w:val="21"/>
+          <w:szCs w:val="21"/>
+        </w:rPr>
+        <w:t xml:space="preserve"> </w:t>
+      </w:r>
+      <w:proofErr w:type="spellStart"/>
+      <w:r>
+        <w:rPr>
+          <w:rFonts w:ascii="Consolas" w:hAnsi="Consolas"/>
+          <w:color w:val="4EC9B0"/>
+          <w:sz w:val="21"/>
+          <w:szCs w:val="21"/>
+        </w:rPr>
+        <w:t>PatientRepository</w:t>
+      </w:r>
+      <w:proofErr w:type="spellEnd"/>
+      <w:r>
+        <w:rPr>
+          <w:rFonts w:ascii="Consolas" w:hAnsi="Consolas"/>
+          <w:color w:val="CCCCCC"/>
+          <w:sz w:val="21"/>
+          <w:szCs w:val="21"/>
+        </w:rPr>
+        <w:t xml:space="preserve"> </w:t>
+      </w:r>
+      <w:proofErr w:type="spellStart"/>
+      <w:r>
+        <w:rPr>
+          <w:rFonts w:ascii="Consolas" w:hAnsi="Consolas"/>
+          <w:color w:val="4FC1FF"/>
+          <w:sz w:val="21"/>
+          <w:szCs w:val="21"/>
+        </w:rPr>
+        <w:t>patientRepository</w:t>
+      </w:r>
+      <w:proofErr w:type="spellEnd"/>
+      <w:r>
+        <w:rPr>
+          <w:rFonts w:ascii="Consolas" w:hAnsi="Consolas"/>
+          <w:color w:val="CCCCCC"/>
+          <w:sz w:val="21"/>
+          <w:szCs w:val="21"/>
+        </w:rPr>
+        <w:t>;</w:t>
+      </w:r>
+    </w:p>
+    <w:p>
+      <w:pPr>
+        <w:pStyle w:val="Prrafodelista"/>
+        <w:numPr>
+          <w:ilvl w:val="0"/>
+          <w:numId w:val="19"/>
+        </w:numPr>
+        <w:shd w:val="clear" w:color="auto" w:fill="1F1F1F"/>
+        <w:spacing w:line="285" w:lineRule="atLeast"/>
+        <w:rPr>
+          <w:rFonts w:ascii="Consolas" w:hAnsi="Consolas"/>
+          <w:color w:val="CCCCCC"/>
+          <w:sz w:val="21"/>
+          <w:szCs w:val="21"/>
+        </w:rPr>
+      </w:pPr>
+      <w:r>
+        <w:rPr>
+          <w:rFonts w:ascii="Consolas" w:hAnsi="Consolas"/>
+          <w:color w:val="CCCCCC"/>
+          <w:sz w:val="21"/>
+          <w:szCs w:val="21"/>
+        </w:rPr>
+        <w:t xml:space="preserve">    </w:t>
+      </w:r>
+      <w:r>
+        <w:rPr>
+          <w:rFonts w:ascii="Consolas" w:hAnsi="Consolas"/>
+          <w:color w:val="569CD6"/>
+          <w:sz w:val="21"/>
+          <w:szCs w:val="21"/>
+        </w:rPr>
+        <w:t>private</w:t>
+      </w:r>
+      <w:r>
+        <w:rPr>
+          <w:rFonts w:ascii="Consolas" w:hAnsi="Consolas"/>
+          <w:color w:val="CCCCCC"/>
+          <w:sz w:val="21"/>
+          <w:szCs w:val="21"/>
+        </w:rPr>
+        <w:t xml:space="preserve"> </w:t>
+      </w:r>
+      <w:r>
+        <w:rPr>
+          <w:rFonts w:ascii="Consolas" w:hAnsi="Consolas"/>
+          <w:color w:val="569CD6"/>
+          <w:sz w:val="21"/>
+          <w:szCs w:val="21"/>
+        </w:rPr>
+        <w:t>final</w:t>
+      </w:r>
+      <w:r>
+        <w:rPr>
+          <w:rFonts w:ascii="Consolas" w:hAnsi="Consolas"/>
+          <w:color w:val="CCCCCC"/>
+          <w:sz w:val="21"/>
+          <w:szCs w:val="21"/>
+        </w:rPr>
+        <w:t xml:space="preserve"> </w:t>
+      </w:r>
+      <w:proofErr w:type="spellStart"/>
+      <w:r>
+        <w:rPr>
+          <w:rFonts w:ascii="Consolas" w:hAnsi="Consolas"/>
+          <w:color w:val="4EC9B0"/>
+          <w:sz w:val="21"/>
+          <w:szCs w:val="21"/>
+        </w:rPr>
+        <w:t>PrescriptionRepository</w:t>
+      </w:r>
+      <w:proofErr w:type="spellEnd"/>
+      <w:r>
+        <w:rPr>
+          <w:rFonts w:ascii="Consolas" w:hAnsi="Consolas"/>
+          <w:color w:val="CCCCCC"/>
+          <w:sz w:val="21"/>
+          <w:szCs w:val="21"/>
+        </w:rPr>
+        <w:t xml:space="preserve"> </w:t>
+      </w:r>
+      <w:proofErr w:type="spellStart"/>
+      <w:r>
+        <w:rPr>
+          <w:rFonts w:ascii="Consolas" w:hAnsi="Consolas"/>
+          <w:color w:val="4FC1FF"/>
+          <w:sz w:val="21"/>
+          <w:szCs w:val="21"/>
+        </w:rPr>
+        <w:t>prescriptionRepository</w:t>
+      </w:r>
+      <w:proofErr w:type="spellEnd"/>
+      <w:r>
+        <w:rPr>
+          <w:rFonts w:ascii="Consolas" w:hAnsi="Consolas"/>
+          <w:color w:val="CCCCCC"/>
+          <w:sz w:val="21"/>
+          <w:szCs w:val="21"/>
+        </w:rPr>
+        <w:t>;</w:t>
+      </w:r>
+    </w:p>
+    <w:p>
+      <w:pPr>
+        <w:pStyle w:val="Prrafodelista"/>
+        <w:numPr>
+          <w:ilvl w:val="0"/>
+          <w:numId w:val="19"/>
+        </w:numPr>
+        <w:shd w:val="clear" w:color="auto" w:fill="1F1F1F"/>
+        <w:spacing w:line="285" w:lineRule="atLeast"/>
+        <w:rPr>
+          <w:rFonts w:ascii="Consolas" w:hAnsi="Consolas"/>
+          <w:color w:val="CCCCCC"/>
+          <w:sz w:val="21"/>
+          <w:szCs w:val="21"/>
+        </w:rPr>
+      </w:pPr>
+    </w:p>
+    <w:p>
+      <w:pPr>
+        <w:pStyle w:val="Prrafodelista"/>
+        <w:numPr>
+          <w:ilvl w:val="0"/>
+          <w:numId w:val="19"/>
+        </w:numPr>
+        <w:shd w:val="clear" w:color="auto" w:fill="1F1F1F"/>
+        <w:spacing w:line="285" w:lineRule="atLeast"/>
+        <w:rPr>
+          <w:rFonts w:ascii="Consolas" w:hAnsi="Consolas"/>
+          <w:color w:val="CCCCCC"/>
+          <w:sz w:val="21"/>
+          <w:szCs w:val="21"/>
+        </w:rPr>
+      </w:pPr>
+      <w:r>
+        <w:rPr>
+          <w:rFonts w:ascii="Consolas" w:hAnsi="Consolas"/>
+          <w:color w:val="CCCCCC"/>
+          <w:sz w:val="21"/>
+          <w:szCs w:val="21"/>
+        </w:rPr>
+        <w:t xml:space="preserve">    </w:t>
+      </w:r>
+      <w:r>
+        <w:rPr>
+          <w:rFonts w:ascii="Consolas" w:hAnsi="Consolas"/>
+          <w:color w:val="569CD6"/>
+          <w:sz w:val="21"/>
+          <w:szCs w:val="21"/>
+        </w:rPr>
+        <w:t>public</w:t>
+      </w:r>
+      <w:r>
+        <w:rPr>
+          <w:rFonts w:ascii="Consolas" w:hAnsi="Consolas"/>
+          <w:color w:val="CCCCCC"/>
+          <w:sz w:val="21"/>
+          <w:szCs w:val="21"/>
+        </w:rPr>
+        <w:t xml:space="preserve"> </w:t>
+      </w:r>
+      <w:proofErr w:type="spellStart"/>
+      <w:proofErr w:type="gramStart"/>
+      <w:r>
+        <w:rPr>
+          <w:rFonts w:ascii="Consolas" w:hAnsi="Consolas"/>
+          <w:color w:val="DCDCAA"/>
+          <w:sz w:val="21"/>
+          <w:szCs w:val="21"/>
+        </w:rPr>
+        <w:t>TestBuilderController</w:t>
+      </w:r>
+      <w:proofErr w:type="spellEnd"/>
+      <w:r>
+        <w:rPr>
+          <w:rFonts w:ascii="Consolas" w:hAnsi="Consolas"/>
+          <w:color w:val="CCCCCC"/>
+          <w:sz w:val="21"/>
+          <w:szCs w:val="21"/>
+        </w:rPr>
+        <w:t>(</w:t>
+      </w:r>
+      <w:proofErr w:type="spellStart"/>
+      <w:proofErr w:type="gramEnd"/>
+      <w:r>
+        <w:rPr>
+          <w:rFonts w:ascii="Consolas" w:hAnsi="Consolas"/>
+          <w:color w:val="4EC9B0"/>
+          <w:sz w:val="21"/>
+          <w:szCs w:val="21"/>
+        </w:rPr>
+        <w:t>PatientRepository</w:t>
+      </w:r>
+      <w:proofErr w:type="spellEnd"/>
+      <w:r>
+        <w:rPr>
+          <w:rFonts w:ascii="Consolas" w:hAnsi="Consolas"/>
+          <w:color w:val="CCCCCC"/>
+          <w:sz w:val="21"/>
+          <w:szCs w:val="21"/>
+        </w:rPr>
+        <w:t xml:space="preserve"> </w:t>
+      </w:r>
+      <w:proofErr w:type="spellStart"/>
+      <w:r>
+        <w:rPr>
+          <w:rFonts w:ascii="Consolas" w:hAnsi="Consolas"/>
+          <w:color w:val="9CDCFE"/>
+          <w:sz w:val="21"/>
+          <w:szCs w:val="21"/>
+        </w:rPr>
+        <w:t>patientRepository</w:t>
+      </w:r>
+      <w:proofErr w:type="spellEnd"/>
+      <w:r>
+        <w:rPr>
+          <w:rFonts w:ascii="Consolas" w:hAnsi="Consolas"/>
+          <w:color w:val="CCCCCC"/>
+          <w:sz w:val="21"/>
+          <w:szCs w:val="21"/>
+        </w:rPr>
+        <w:t>,</w:t>
+      </w:r>
+    </w:p>
+    <w:p>
+      <w:pPr>
+        <w:pStyle w:val="Prrafodelista"/>
+        <w:numPr>
+          <w:ilvl w:val="0"/>
+          <w:numId w:val="19"/>
+        </w:numPr>
+        <w:shd w:val="clear" w:color="auto" w:fill="1F1F1F"/>
+        <w:spacing w:line="285" w:lineRule="atLeast"/>
+        <w:rPr>
+          <w:rFonts w:ascii="Consolas" w:hAnsi="Consolas"/>
+          <w:color w:val="CCCCCC"/>
+          <w:sz w:val="21"/>
+          <w:szCs w:val="21"/>
+        </w:rPr>
+      </w:pPr>
+      <w:r>
+        <w:rPr>
+          <w:rFonts w:ascii="Consolas" w:hAnsi="Consolas"/>
+          <w:color w:val="CCCCCC"/>
+          <w:sz w:val="21"/>
+          <w:szCs w:val="21"/>
+        </w:rPr>
+        <w:t>                                 </w:t>
+      </w:r>
+      <w:proofErr w:type="spellStart"/>
+      <w:r>
+        <w:rPr>
+          <w:rFonts w:ascii="Consolas" w:hAnsi="Consolas"/>
+          <w:color w:val="4EC9B0"/>
+          <w:sz w:val="21"/>
+          <w:szCs w:val="21"/>
+        </w:rPr>
+        <w:t>PrescriptionRepository</w:t>
+      </w:r>
+      <w:proofErr w:type="spellEnd"/>
+      <w:r>
+        <w:rPr>
+          <w:rFonts w:ascii="Consolas" w:hAnsi="Consolas"/>
+          <w:color w:val="CCCCCC"/>
+          <w:sz w:val="21"/>
+          <w:szCs w:val="21"/>
+        </w:rPr>
+        <w:t xml:space="preserve"> </w:t>
+      </w:r>
+      <w:proofErr w:type="spellStart"/>
+      <w:r>
+        <w:rPr>
+          <w:rFonts w:ascii="Consolas" w:hAnsi="Consolas"/>
+          <w:color w:val="9CDCFE"/>
+          <w:sz w:val="21"/>
+          <w:szCs w:val="21"/>
+        </w:rPr>
+        <w:t>prescriptionRepository</w:t>
+      </w:r>
+      <w:proofErr w:type="spellEnd"/>
+      <w:r>
+        <w:rPr>
+          <w:rFonts w:ascii="Consolas" w:hAnsi="Consolas"/>
+          <w:color w:val="CCCCCC"/>
+          <w:sz w:val="21"/>
+          <w:szCs w:val="21"/>
+        </w:rPr>
+        <w:t>) {</w:t>
+      </w:r>
+    </w:p>
+    <w:p>
+      <w:pPr>
+        <w:pStyle w:val="Prrafodelista"/>
+        <w:numPr>
+          <w:ilvl w:val="0"/>
+          <w:numId w:val="19"/>
+        </w:numPr>
+        <w:shd w:val="clear" w:color="auto" w:fill="1F1F1F"/>
+        <w:spacing w:line="285" w:lineRule="atLeast"/>
+        <w:rPr>
+          <w:rFonts w:ascii="Consolas" w:hAnsi="Consolas"/>
+          <w:color w:val="CCCCCC"/>
+          <w:sz w:val="21"/>
+          <w:szCs w:val="21"/>
+        </w:rPr>
+      </w:pPr>
+      <w:r>
+        <w:rPr>
+          <w:rFonts w:ascii="Consolas" w:hAnsi="Consolas"/>
+          <w:color w:val="CCCCCC"/>
+          <w:sz w:val="21"/>
+          <w:szCs w:val="21"/>
+        </w:rPr>
+        <w:t xml:space="preserve">        </w:t>
+      </w:r>
+      <w:proofErr w:type="spellStart"/>
+      <w:proofErr w:type="gramStart"/>
+      <w:r>
+        <w:rPr>
+          <w:rFonts w:ascii="Consolas" w:hAnsi="Consolas"/>
+          <w:color w:val="569CD6"/>
+          <w:sz w:val="21"/>
+          <w:szCs w:val="21"/>
+        </w:rPr>
+        <w:t>this</w:t>
+      </w:r>
+      <w:r>
+        <w:rPr>
+          <w:rFonts w:ascii="Consolas" w:hAnsi="Consolas"/>
+          <w:color w:val="CCCCCC"/>
+          <w:sz w:val="21"/>
+          <w:szCs w:val="21"/>
+        </w:rPr>
+        <w:t>.</w:t>
+      </w:r>
+      <w:r>
+        <w:rPr>
+          <w:rFonts w:ascii="Consolas" w:hAnsi="Consolas"/>
+          <w:color w:val="4FC1FF"/>
+          <w:sz w:val="21"/>
+          <w:szCs w:val="21"/>
+        </w:rPr>
+        <w:t>patientRepository</w:t>
+      </w:r>
+      <w:proofErr w:type="spellEnd"/>
+      <w:proofErr w:type="gramEnd"/>
+      <w:r>
+        <w:rPr>
+          <w:rFonts w:ascii="Consolas" w:hAnsi="Consolas"/>
+          <w:color w:val="CCCCCC"/>
+          <w:sz w:val="21"/>
+          <w:szCs w:val="21"/>
+        </w:rPr>
+        <w:t xml:space="preserve"> </w:t>
+      </w:r>
+      <w:r>
+        <w:rPr>
+          <w:rFonts w:ascii="Consolas" w:hAnsi="Consolas"/>
+          <w:color w:val="D4D4D4"/>
+          <w:sz w:val="21"/>
+          <w:szCs w:val="21"/>
+        </w:rPr>
+        <w:t>=</w:t>
+      </w:r>
+      <w:r>
+        <w:rPr>
+          <w:rFonts w:ascii="Consolas" w:hAnsi="Consolas"/>
+          <w:color w:val="CCCCCC"/>
+          <w:sz w:val="21"/>
+          <w:szCs w:val="21"/>
+        </w:rPr>
+        <w:t xml:space="preserve"> </w:t>
+      </w:r>
+      <w:proofErr w:type="spellStart"/>
+      <w:r>
+        <w:rPr>
+          <w:rFonts w:ascii="Consolas" w:hAnsi="Consolas"/>
+          <w:color w:val="9CDCFE"/>
+          <w:sz w:val="21"/>
+          <w:szCs w:val="21"/>
+        </w:rPr>
+        <w:t>patientRepository</w:t>
+      </w:r>
+      <w:proofErr w:type="spellEnd"/>
+      <w:r>
+        <w:rPr>
+          <w:rFonts w:ascii="Consolas" w:hAnsi="Consolas"/>
+          <w:color w:val="CCCCCC"/>
+          <w:sz w:val="21"/>
+          <w:szCs w:val="21"/>
+        </w:rPr>
+        <w:t>;</w:t>
+      </w:r>
+    </w:p>
+    <w:p>
+      <w:pPr>
+        <w:pStyle w:val="Prrafodelista"/>
+        <w:numPr>
+          <w:ilvl w:val="0"/>
+          <w:numId w:val="19"/>
+        </w:numPr>
+        <w:shd w:val="clear" w:color="auto" w:fill="1F1F1F"/>
+        <w:spacing w:line="285" w:lineRule="atLeast"/>
+        <w:rPr>
+          <w:rFonts w:ascii="Consolas" w:hAnsi="Consolas"/>
+          <w:color w:val="CCCCCC"/>
+          <w:sz w:val="21"/>
+          <w:szCs w:val="21"/>
+        </w:rPr>
+      </w:pPr>
+      <w:r>
+        <w:rPr>
+          <w:rFonts w:ascii="Consolas" w:hAnsi="Consolas"/>
+          <w:color w:val="CCCCCC"/>
+          <w:sz w:val="21"/>
+          <w:szCs w:val="21"/>
+        </w:rPr>
+        <w:t xml:space="preserve">        </w:t>
+      </w:r>
+      <w:proofErr w:type="spellStart"/>
+      <w:proofErr w:type="gramStart"/>
+      <w:r>
+        <w:rPr>
+          <w:rFonts w:ascii="Consolas" w:hAnsi="Consolas"/>
+          <w:color w:val="569CD6"/>
+          <w:sz w:val="21"/>
+          <w:szCs w:val="21"/>
+        </w:rPr>
+        <w:t>this</w:t>
+      </w:r>
+      <w:r>
+        <w:rPr>
+          <w:rFonts w:ascii="Consolas" w:hAnsi="Consolas"/>
+          <w:color w:val="CCCCCC"/>
+          <w:sz w:val="21"/>
+          <w:szCs w:val="21"/>
+        </w:rPr>
+        <w:t>.</w:t>
+      </w:r>
+      <w:r>
+        <w:rPr>
+          <w:rFonts w:ascii="Consolas" w:hAnsi="Consolas"/>
+          <w:color w:val="4FC1FF"/>
+          <w:sz w:val="21"/>
+          <w:szCs w:val="21"/>
+        </w:rPr>
+        <w:t>prescriptionRepository</w:t>
+      </w:r>
+      <w:proofErr w:type="spellEnd"/>
+      <w:proofErr w:type="gramEnd"/>
+      <w:r>
+        <w:rPr>
+          <w:rFonts w:ascii="Consolas" w:hAnsi="Consolas"/>
+          <w:color w:val="CCCCCC"/>
+          <w:sz w:val="21"/>
+          <w:szCs w:val="21"/>
+        </w:rPr>
+        <w:t xml:space="preserve"> </w:t>
+      </w:r>
+      <w:r>
+        <w:rPr>
+          <w:rFonts w:ascii="Consolas" w:hAnsi="Consolas"/>
+          <w:color w:val="D4D4D4"/>
+          <w:sz w:val="21"/>
+          <w:szCs w:val="21"/>
+        </w:rPr>
+        <w:t>=</w:t>
+      </w:r>
+      <w:r>
+        <w:rPr>
+          <w:rFonts w:ascii="Consolas" w:hAnsi="Consolas"/>
+          <w:color w:val="CCCCCC"/>
+          <w:sz w:val="21"/>
+          <w:szCs w:val="21"/>
+        </w:rPr>
+        <w:t xml:space="preserve"> </w:t>
+      </w:r>
+      <w:proofErr w:type="spellStart"/>
+      <w:r>
+        <w:rPr>
+          <w:rFonts w:ascii="Consolas" w:hAnsi="Consolas"/>
+          <w:color w:val="9CDCFE"/>
+          <w:sz w:val="21"/>
+          <w:szCs w:val="21"/>
+        </w:rPr>
+        <w:t>prescriptionRepository</w:t>
+      </w:r>
+      <w:proofErr w:type="spellEnd"/>
+      <w:r>
+        <w:rPr>
+          <w:rFonts w:ascii="Consolas" w:hAnsi="Consolas"/>
+          <w:color w:val="CCCCCC"/>
+          <w:sz w:val="21"/>
+          <w:szCs w:val="21"/>
+        </w:rPr>
+        <w:t>;</w:t>
+      </w:r>
+    </w:p>
+    <w:p>
+      <w:pPr>
+        <w:pStyle w:val="Prrafodelista"/>
+        <w:numPr>
+          <w:ilvl w:val="0"/>
+          <w:numId w:val="19"/>
+        </w:numPr>
+        <w:shd w:val="clear" w:color="auto" w:fill="1F1F1F"/>
+        <w:spacing w:line="285" w:lineRule="atLeast"/>
+        <w:rPr>
+          <w:rFonts w:ascii="Consolas" w:hAnsi="Consolas"/>
+          <w:color w:val="CCCCCC"/>
+          <w:sz w:val="21"/>
+          <w:szCs w:val="21"/>
+        </w:rPr>
+      </w:pPr>
+      <w:r>
+        <w:rPr>
+          <w:rFonts w:ascii="Consolas" w:hAnsi="Consolas"/>
+          <w:color w:val="CCCCCC"/>
+          <w:sz w:val="21"/>
+          <w:szCs w:val="21"/>
+        </w:rPr>
+        <w:t>    }</w:t>
+      </w:r>
+    </w:p>
+    <w:p>
+      <w:pPr>
+        <w:pStyle w:val="Prrafodelista"/>
+        <w:numPr>
+          <w:ilvl w:val="0"/>
+          <w:numId w:val="19"/>
+        </w:numPr>
+        <w:shd w:val="clear" w:color="auto" w:fill="1F1F1F"/>
+        <w:spacing w:line="285" w:lineRule="atLeast"/>
+        <w:rPr>
+          <w:rFonts w:ascii="Consolas" w:hAnsi="Consolas"/>
+          <w:color w:val="CCCCCC"/>
+          <w:sz w:val="21"/>
+          <w:szCs w:val="21"/>
+        </w:rPr>
+      </w:pPr>
+    </w:p>
+    <w:p>
+      <w:pPr>
+        <w:pStyle w:val="Prrafodelista"/>
+        <w:numPr>
+          <w:ilvl w:val="0"/>
+          <w:numId w:val="19"/>
+        </w:numPr>
+        <w:shd w:val="clear" w:color="auto" w:fill="1F1F1F"/>
+        <w:spacing w:line="285" w:lineRule="atLeast"/>
+        <w:rPr>
+          <w:rFonts w:ascii="Consolas" w:hAnsi="Consolas"/>
+          <w:color w:val="CCCCCC"/>
+          <w:sz w:val="21"/>
+          <w:szCs w:val="21"/>
+        </w:rPr>
+      </w:pPr>
+      <w:r>
+        <w:rPr>
+          <w:rFonts w:ascii="Consolas" w:hAnsi="Consolas"/>
+          <w:color w:val="CCCCCC"/>
+          <w:sz w:val="21"/>
+          <w:szCs w:val="21"/>
+        </w:rPr>
+        <w:t>    @</w:t>
+      </w:r>
+      <w:r>
+        <w:rPr>
+          <w:rFonts w:ascii="Consolas" w:hAnsi="Consolas"/>
+          <w:color w:val="4EC9B0"/>
+          <w:sz w:val="21"/>
+          <w:szCs w:val="21"/>
+        </w:rPr>
+        <w:t>PostMapping</w:t>
+      </w:r>
+      <w:r>
+        <w:rPr>
+          <w:rFonts w:ascii="Consolas" w:hAnsi="Consolas"/>
+          <w:color w:val="CCCCCC"/>
+          <w:sz w:val="21"/>
+          <w:szCs w:val="21"/>
+        </w:rPr>
+        <w:t>(</w:t>
+      </w:r>
+      <w:r>
+        <w:rPr>
+          <w:rFonts w:ascii="Consolas" w:hAnsi="Consolas"/>
+          <w:color w:val="CE9178"/>
+          <w:sz w:val="21"/>
+          <w:szCs w:val="21"/>
+        </w:rPr>
+        <w:t>"/builder/{patientId}"</w:t>
+      </w:r>
+      <w:r>
+        <w:rPr>
+          <w:rFonts w:ascii="Consolas" w:hAnsi="Consolas"/>
+          <w:color w:val="CCCCCC"/>
+          <w:sz w:val="21"/>
+          <w:szCs w:val="21"/>
+        </w:rPr>
+        <w:t>)</w:t>
+      </w:r>
+    </w:p>
+    <w:p>
+      <w:pPr>
+        <w:pStyle w:val="Prrafodelista"/>
+        <w:numPr>
+          <w:ilvl w:val="0"/>
+          <w:numId w:val="19"/>
+        </w:numPr>
+        <w:shd w:val="clear" w:color="auto" w:fill="1F1F1F"/>
+        <w:spacing w:line="285" w:lineRule="atLeast"/>
+        <w:rPr>
+          <w:rFonts w:ascii="Consolas" w:hAnsi="Consolas"/>
+          <w:color w:val="CCCCCC"/>
+          <w:sz w:val="21"/>
+          <w:szCs w:val="21"/>
+        </w:rPr>
+      </w:pPr>
+      <w:r>
+        <w:rPr>
+          <w:rFonts w:ascii="Consolas" w:hAnsi="Consolas"/>
+          <w:color w:val="CCCCCC"/>
+          <w:sz w:val="21"/>
+          <w:szCs w:val="21"/>
+        </w:rPr>
+        <w:t xml:space="preserve">    </w:t>
+      </w:r>
+      <w:r>
+        <w:rPr>
+          <w:rFonts w:ascii="Consolas" w:hAnsi="Consolas"/>
+          <w:color w:val="569CD6"/>
+          <w:sz w:val="21"/>
+          <w:szCs w:val="21"/>
+        </w:rPr>
+        <w:t>public</w:t>
+      </w:r>
+      <w:r>
+        <w:rPr>
+          <w:rFonts w:ascii="Consolas" w:hAnsi="Consolas"/>
+          <w:color w:val="CCCCCC"/>
+          <w:sz w:val="21"/>
+          <w:szCs w:val="21"/>
+        </w:rPr>
+        <w:t xml:space="preserve"> </w:t>
+      </w:r>
+      <w:proofErr w:type="spellStart"/>
+      <w:r>
+        <w:rPr>
+          <w:rFonts w:ascii="Consolas" w:hAnsi="Consolas"/>
+          <w:color w:val="4EC9B0"/>
+          <w:sz w:val="21"/>
+          <w:szCs w:val="21"/>
+        </w:rPr>
+        <w:t>Prescription</w:t>
+      </w:r>
+      <w:proofErr w:type="spellEnd"/>
+      <w:r>
+        <w:rPr>
+          <w:rFonts w:ascii="Consolas" w:hAnsi="Consolas"/>
+          <w:color w:val="CCCCCC"/>
+          <w:sz w:val="21"/>
+          <w:szCs w:val="21"/>
+        </w:rPr>
+        <w:t xml:space="preserve"> </w:t>
+      </w:r>
+      <w:proofErr w:type="spellStart"/>
+      <w:proofErr w:type="gramStart"/>
+      <w:r>
+        <w:rPr>
+          <w:rFonts w:ascii="Consolas" w:hAnsi="Consolas"/>
+          <w:color w:val="DCDCAA"/>
+          <w:sz w:val="21"/>
+          <w:szCs w:val="21"/>
+        </w:rPr>
+        <w:t>createPrescriptionWithBuilder</w:t>
+      </w:r>
+      <w:proofErr w:type="spellEnd"/>
+      <w:r>
+        <w:rPr>
+          <w:rFonts w:ascii="Consolas" w:hAnsi="Consolas"/>
+          <w:color w:val="CCCCCC"/>
+          <w:sz w:val="21"/>
+          <w:szCs w:val="21"/>
+        </w:rPr>
+        <w:t>(</w:t>
+      </w:r>
+      <w:proofErr w:type="gramEnd"/>
+      <w:r>
+        <w:rPr>
+          <w:rFonts w:ascii="Consolas" w:hAnsi="Consolas"/>
+          <w:color w:val="CCCCCC"/>
+          <w:sz w:val="21"/>
+          <w:szCs w:val="21"/>
+        </w:rPr>
+        <w:t>@</w:t>
+      </w:r>
+      <w:r>
+        <w:rPr>
+          <w:rFonts w:ascii="Consolas" w:hAnsi="Consolas"/>
+          <w:color w:val="4EC9B0"/>
+          <w:sz w:val="21"/>
+          <w:szCs w:val="21"/>
+        </w:rPr>
+        <w:t>PathVariable</w:t>
+      </w:r>
+      <w:r>
+        <w:rPr>
+          <w:rFonts w:ascii="Consolas" w:hAnsi="Consolas"/>
+          <w:color w:val="CCCCCC"/>
+          <w:sz w:val="21"/>
+          <w:szCs w:val="21"/>
+        </w:rPr>
+        <w:t xml:space="preserve"> </w:t>
+      </w:r>
+      <w:r>
+        <w:rPr>
+          <w:rFonts w:ascii="Consolas" w:hAnsi="Consolas"/>
+          <w:color w:val="4EC9B0"/>
+          <w:sz w:val="21"/>
+          <w:szCs w:val="21"/>
+        </w:rPr>
+        <w:t>UUID</w:t>
+      </w:r>
+      <w:r>
+        <w:rPr>
+          <w:rFonts w:ascii="Consolas" w:hAnsi="Consolas"/>
+          <w:color w:val="CCCCCC"/>
+          <w:sz w:val="21"/>
+          <w:szCs w:val="21"/>
+        </w:rPr>
+        <w:t xml:space="preserve"> </w:t>
+      </w:r>
+      <w:proofErr w:type="spellStart"/>
+      <w:r>
+        <w:rPr>
+          <w:rFonts w:ascii="Consolas" w:hAnsi="Consolas"/>
+          <w:color w:val="9CDCFE"/>
+          <w:sz w:val="21"/>
+          <w:szCs w:val="21"/>
+        </w:rPr>
+        <w:t>patientId</w:t>
+      </w:r>
+      <w:proofErr w:type="spellEnd"/>
+      <w:r>
+        <w:rPr>
+          <w:rFonts w:ascii="Consolas" w:hAnsi="Consolas"/>
+          <w:color w:val="CCCCCC"/>
+          <w:sz w:val="21"/>
+          <w:szCs w:val="21"/>
+        </w:rPr>
+        <w:t>) {</w:t>
+      </w:r>
+    </w:p>
+    <w:p>
+      <w:pPr>
+        <w:pStyle w:val="Prrafodelista"/>
+        <w:numPr>
+          <w:ilvl w:val="0"/>
+          <w:numId w:val="19"/>
+        </w:numPr>
+        <w:shd w:val="clear" w:color="auto" w:fill="1F1F1F"/>
+        <w:spacing w:line="285" w:lineRule="atLeast"/>
+        <w:rPr>
+          <w:rFonts w:ascii="Consolas" w:hAnsi="Consolas"/>
+          <w:color w:val="CCCCCC"/>
+          <w:sz w:val="21"/>
+          <w:szCs w:val="21"/>
+        </w:rPr>
+      </w:pPr>
+    </w:p>
+    <w:p>
+      <w:pPr>
+        <w:pStyle w:val="Prrafodelista"/>
+        <w:numPr>
+          <w:ilvl w:val="0"/>
+          <w:numId w:val="19"/>
+        </w:numPr>
+        <w:shd w:val="clear" w:color="auto" w:fill="1F1F1F"/>
+        <w:spacing w:line="285" w:lineRule="atLeast"/>
+        <w:rPr>
+          <w:rFonts w:ascii="Consolas" w:hAnsi="Consolas"/>
+          <w:color w:val="CCCCCC"/>
+          <w:sz w:val="21"/>
+          <w:szCs w:val="21"/>
+        </w:rPr>
+      </w:pPr>
+      <w:r>
+        <w:rPr>
+          <w:rFonts w:ascii="Consolas" w:hAnsi="Consolas"/>
+          <w:color w:val="CCCCCC"/>
+          <w:sz w:val="21"/>
+          <w:szCs w:val="21"/>
+        </w:rPr>
+        <w:t xml:space="preserve">        </w:t>
+      </w:r>
+      <w:proofErr w:type="spellStart"/>
+      <w:r>
+        <w:rPr>
+          <w:rFonts w:ascii="Consolas" w:hAnsi="Consolas"/>
+          <w:color w:val="4EC9B0"/>
+          <w:sz w:val="21"/>
+          <w:szCs w:val="21"/>
+        </w:rPr>
+        <w:t>Patient</w:t>
+      </w:r>
+      <w:proofErr w:type="spellEnd"/>
+      <w:r>
+        <w:rPr>
+          <w:rFonts w:ascii="Consolas" w:hAnsi="Consolas"/>
+          <w:color w:val="CCCCCC"/>
+          <w:sz w:val="21"/>
+          <w:szCs w:val="21"/>
+        </w:rPr>
+        <w:t xml:space="preserve"> </w:t>
+      </w:r>
+      <w:proofErr w:type="spellStart"/>
+      <w:r>
+        <w:rPr>
+          <w:rFonts w:ascii="Consolas" w:hAnsi="Consolas"/>
+          <w:color w:val="9CDCFE"/>
+          <w:sz w:val="21"/>
+          <w:szCs w:val="21"/>
+        </w:rPr>
+        <w:t>patient</w:t>
+      </w:r>
+      <w:proofErr w:type="spellEnd"/>
+      <w:r>
+        <w:rPr>
+          <w:rFonts w:ascii="Consolas" w:hAnsi="Consolas"/>
+          <w:color w:val="CCCCCC"/>
+          <w:sz w:val="21"/>
+          <w:szCs w:val="21"/>
+        </w:rPr>
+        <w:t xml:space="preserve"> </w:t>
+      </w:r>
+      <w:r>
+        <w:rPr>
+          <w:rFonts w:ascii="Consolas" w:hAnsi="Consolas"/>
+          <w:color w:val="D4D4D4"/>
+          <w:sz w:val="21"/>
+          <w:szCs w:val="21"/>
+        </w:rPr>
+        <w:t>=</w:t>
+      </w:r>
+      <w:r>
+        <w:rPr>
+          <w:rFonts w:ascii="Consolas" w:hAnsi="Consolas"/>
+          <w:color w:val="CCCCCC"/>
+          <w:sz w:val="21"/>
+          <w:szCs w:val="21"/>
+        </w:rPr>
+        <w:t xml:space="preserve"> </w:t>
+      </w:r>
+      <w:proofErr w:type="spellStart"/>
+      <w:r>
+        <w:rPr>
+          <w:rFonts w:ascii="Consolas" w:hAnsi="Consolas"/>
+          <w:color w:val="4FC1FF"/>
+          <w:sz w:val="21"/>
+          <w:szCs w:val="21"/>
+        </w:rPr>
+        <w:t>patientRepository</w:t>
+      </w:r>
+      <w:r>
+        <w:rPr>
+          <w:rFonts w:ascii="Consolas" w:hAnsi="Consolas"/>
+          <w:color w:val="CCCCCC"/>
+          <w:sz w:val="21"/>
+          <w:szCs w:val="21"/>
+        </w:rPr>
+        <w:t>.</w:t>
+      </w:r>
+      <w:r>
+        <w:rPr>
+          <w:rFonts w:ascii="Consolas" w:hAnsi="Consolas"/>
+          <w:color w:val="DCDCAA"/>
+          <w:sz w:val="21"/>
+          <w:szCs w:val="21"/>
+        </w:rPr>
+        <w:t>findById</w:t>
+      </w:r>
+      <w:proofErr w:type="spellEnd"/>
+      <w:r>
+        <w:rPr>
+          <w:rFonts w:ascii="Consolas" w:hAnsi="Consolas"/>
+          <w:color w:val="CCCCCC"/>
+          <w:sz w:val="21"/>
+          <w:szCs w:val="21"/>
+        </w:rPr>
+        <w:t>(</w:t>
+      </w:r>
+      <w:proofErr w:type="spellStart"/>
+      <w:r>
+        <w:rPr>
+          <w:rFonts w:ascii="Consolas" w:hAnsi="Consolas"/>
+          <w:color w:val="9CDCFE"/>
+          <w:sz w:val="21"/>
+          <w:szCs w:val="21"/>
+        </w:rPr>
+        <w:t>patientId</w:t>
+      </w:r>
+      <w:proofErr w:type="spellEnd"/>
+      <w:proofErr w:type="gramStart"/>
+      <w:r>
+        <w:rPr>
+          <w:rFonts w:ascii="Consolas" w:hAnsi="Consolas"/>
+          <w:color w:val="CCCCCC"/>
+          <w:sz w:val="21"/>
+          <w:szCs w:val="21"/>
+        </w:rPr>
+        <w:t>).</w:t>
+      </w:r>
+      <w:proofErr w:type="spellStart"/>
+      <w:r>
+        <w:rPr>
+          <w:rFonts w:ascii="Consolas" w:hAnsi="Consolas"/>
+          <w:color w:val="DCDCAA"/>
+          <w:sz w:val="21"/>
+          <w:szCs w:val="21"/>
+        </w:rPr>
+        <w:t>orElseThrow</w:t>
+      </w:r>
+      <w:proofErr w:type="spellEnd"/>
+      <w:proofErr w:type="gramEnd"/>
+      <w:r>
+        <w:rPr>
+          <w:rFonts w:ascii="Consolas" w:hAnsi="Consolas"/>
+          <w:color w:val="CCCCCC"/>
+          <w:sz w:val="21"/>
+          <w:szCs w:val="21"/>
+        </w:rPr>
+        <w:t>();</w:t>
+      </w:r>
+    </w:p>
+    <w:p>
+      <w:pPr>
+        <w:pStyle w:val="Prrafodelista"/>
+        <w:numPr>
+          <w:ilvl w:val="0"/>
+          <w:numId w:val="19"/>
+        </w:numPr>
+        <w:shd w:val="clear" w:color="auto" w:fill="1F1F1F"/>
+        <w:spacing w:line="285" w:lineRule="atLeast"/>
+        <w:rPr>
+          <w:rFonts w:ascii="Consolas" w:hAnsi="Consolas"/>
+          <w:color w:val="CCCCCC"/>
+          <w:sz w:val="21"/>
+          <w:szCs w:val="21"/>
+        </w:rPr>
+      </w:pPr>
+    </w:p>
+    <w:p>
+      <w:pPr>
+        <w:pStyle w:val="Prrafodelista"/>
+        <w:numPr>
+          <w:ilvl w:val="0"/>
+          <w:numId w:val="19"/>
+        </w:numPr>
+        <w:shd w:val="clear" w:color="auto" w:fill="1F1F1F"/>
+        <w:spacing w:line="285" w:lineRule="atLeast"/>
+        <w:rPr>
+          <w:rFonts w:ascii="Consolas" w:hAnsi="Consolas"/>
+          <w:color w:val="CCCCCC"/>
+          <w:sz w:val="21"/>
+          <w:szCs w:val="21"/>
+        </w:rPr>
+      </w:pPr>
+      <w:r>
+        <w:rPr>
+          <w:rFonts w:ascii="Consolas" w:hAnsi="Consolas"/>
+          <w:color w:val="CCCCCC"/>
+          <w:sz w:val="21"/>
+          <w:szCs w:val="21"/>
+        </w:rPr>
+        <w:t xml:space="preserve">        </w:t>
+      </w:r>
+      <w:proofErr w:type="spellStart"/>
+      <w:r>
+        <w:rPr>
+          <w:rFonts w:ascii="Consolas" w:hAnsi="Consolas"/>
+          <w:color w:val="4EC9B0"/>
+          <w:sz w:val="21"/>
+          <w:szCs w:val="21"/>
+        </w:rPr>
+        <w:t>Prescription</w:t>
+      </w:r>
+      <w:proofErr w:type="spellEnd"/>
+      <w:r>
+        <w:rPr>
+          <w:rFonts w:ascii="Consolas" w:hAnsi="Consolas"/>
+          <w:color w:val="CCCCCC"/>
+          <w:sz w:val="21"/>
+          <w:szCs w:val="21"/>
+        </w:rPr>
+        <w:t xml:space="preserve"> </w:t>
+      </w:r>
+      <w:proofErr w:type="spellStart"/>
+      <w:r>
+        <w:rPr>
+          <w:rFonts w:ascii="Consolas" w:hAnsi="Consolas"/>
+          <w:color w:val="9CDCFE"/>
+          <w:sz w:val="21"/>
+          <w:szCs w:val="21"/>
+        </w:rPr>
+        <w:t>prescription</w:t>
+      </w:r>
+      <w:proofErr w:type="spellEnd"/>
+      <w:r>
+        <w:rPr>
+          <w:rFonts w:ascii="Consolas" w:hAnsi="Consolas"/>
+          <w:color w:val="CCCCCC"/>
+          <w:sz w:val="21"/>
+          <w:szCs w:val="21"/>
+        </w:rPr>
+        <w:t xml:space="preserve"> </w:t>
+      </w:r>
+      <w:r>
+        <w:rPr>
+          <w:rFonts w:ascii="Consolas" w:hAnsi="Consolas"/>
+          <w:color w:val="D4D4D4"/>
+          <w:sz w:val="21"/>
+          <w:szCs w:val="21"/>
+        </w:rPr>
+        <w:t>=</w:t>
+      </w:r>
+      <w:r>
+        <w:rPr>
+          <w:rFonts w:ascii="Consolas" w:hAnsi="Consolas"/>
+          <w:color w:val="CCCCCC"/>
+          <w:sz w:val="21"/>
+          <w:szCs w:val="21"/>
+        </w:rPr>
+        <w:t xml:space="preserve"> </w:t>
+      </w:r>
+      <w:r>
+        <w:rPr>
+          <w:rFonts w:ascii="Consolas" w:hAnsi="Consolas"/>
+          <w:color w:val="C586C0"/>
+          <w:sz w:val="21"/>
+          <w:szCs w:val="21"/>
+        </w:rPr>
+        <w:t>new</w:t>
+      </w:r>
+      <w:r>
+        <w:rPr>
+          <w:rFonts w:ascii="Consolas" w:hAnsi="Consolas"/>
+          <w:color w:val="CCCCCC"/>
+          <w:sz w:val="21"/>
+          <w:szCs w:val="21"/>
+        </w:rPr>
+        <w:t xml:space="preserve"> </w:t>
+      </w:r>
+      <w:proofErr w:type="spellStart"/>
+      <w:proofErr w:type="gramStart"/>
+      <w:r>
+        <w:rPr>
+          <w:rFonts w:ascii="Consolas" w:hAnsi="Consolas"/>
+          <w:color w:val="DCDCAA"/>
+          <w:sz w:val="21"/>
+          <w:szCs w:val="21"/>
+        </w:rPr>
+        <w:t>PrescriptionBuilder</w:t>
+      </w:r>
+      <w:proofErr w:type="spellEnd"/>
+      <w:r>
+        <w:rPr>
+          <w:rFonts w:ascii="Consolas" w:hAnsi="Consolas"/>
+          <w:color w:val="CCCCCC"/>
+          <w:sz w:val="21"/>
+          <w:szCs w:val="21"/>
+        </w:rPr>
+        <w:t>(</w:t>
+      </w:r>
+      <w:proofErr w:type="gramEnd"/>
+      <w:r>
+        <w:rPr>
+          <w:rFonts w:ascii="Consolas" w:hAnsi="Consolas"/>
+          <w:color w:val="CCCCCC"/>
+          <w:sz w:val="21"/>
+          <w:szCs w:val="21"/>
+        </w:rPr>
+        <w:t>)</w:t>
+      </w:r>
+    </w:p>
+    <w:p>
+      <w:pPr>
+        <w:pStyle w:val="Prrafodelista"/>
+        <w:numPr>
+          <w:ilvl w:val="0"/>
+          <w:numId w:val="19"/>
+        </w:numPr>
+        <w:shd w:val="clear" w:color="auto" w:fill="1F1F1F"/>
+        <w:spacing w:line="285" w:lineRule="atLeast"/>
+        <w:rPr>
+          <w:rFonts w:ascii="Consolas" w:hAnsi="Consolas"/>
+          <w:color w:val="CCCCCC"/>
+          <w:sz w:val="21"/>
+          <w:szCs w:val="21"/>
+        </w:rPr>
+      </w:pPr>
+      <w:r>
+        <w:rPr>
+          <w:rFonts w:ascii="Consolas" w:hAnsi="Consolas"/>
+          <w:color w:val="CCCCCC"/>
+          <w:sz w:val="21"/>
+          <w:szCs w:val="21"/>
+        </w:rPr>
+        <w:t xml:space="preserve">                </w:t>
+      </w:r>
+      <w:proofErr w:type="gramStart"/>
+      <w:r>
+        <w:rPr>
+          <w:rFonts w:ascii="Consolas" w:hAnsi="Consolas"/>
+          <w:color w:val="CCCCCC"/>
+          <w:sz w:val="21"/>
+          <w:szCs w:val="21"/>
+        </w:rPr>
+        <w:t>.</w:t>
+      </w:r>
+      <w:proofErr w:type="spellStart"/>
+      <w:r>
+        <w:rPr>
+          <w:rFonts w:ascii="Consolas" w:hAnsi="Consolas"/>
+          <w:color w:val="DCDCAA"/>
+          <w:sz w:val="21"/>
+          <w:szCs w:val="21"/>
+        </w:rPr>
+        <w:t>withPatient</w:t>
+      </w:r>
+      <w:proofErr w:type="spellEnd"/>
+      <w:proofErr w:type="gramEnd"/>
+      <w:r>
+        <w:rPr>
+          <w:rFonts w:ascii="Consolas" w:hAnsi="Consolas"/>
+          <w:color w:val="CCCCCC"/>
+          <w:sz w:val="21"/>
+          <w:szCs w:val="21"/>
+        </w:rPr>
+        <w:t>(</w:t>
+      </w:r>
+      <w:proofErr w:type="spellStart"/>
+      <w:r>
+        <w:rPr>
+          <w:rFonts w:ascii="Consolas" w:hAnsi="Consolas"/>
+          <w:color w:val="9CDCFE"/>
+          <w:sz w:val="21"/>
+          <w:szCs w:val="21"/>
+        </w:rPr>
+        <w:t>patient</w:t>
+      </w:r>
+      <w:proofErr w:type="spellEnd"/>
+      <w:r>
+        <w:rPr>
+          <w:rFonts w:ascii="Consolas" w:hAnsi="Consolas"/>
+          <w:color w:val="CCCCCC"/>
+          <w:sz w:val="21"/>
+          <w:szCs w:val="21"/>
+        </w:rPr>
+        <w:t>)</w:t>
+      </w:r>
+    </w:p>
+    <w:p>
+      <w:pPr>
+        <w:pStyle w:val="Prrafodelista"/>
+        <w:numPr>
+          <w:ilvl w:val="0"/>
+          <w:numId w:val="19"/>
+        </w:numPr>
+        <w:shd w:val="clear" w:color="auto" w:fill="1F1F1F"/>
+        <w:spacing w:line="285" w:lineRule="atLeast"/>
+        <w:rPr>
+          <w:rFonts w:ascii="Consolas" w:hAnsi="Consolas"/>
+          <w:color w:val="CCCCCC"/>
+          <w:sz w:val="21"/>
+          <w:szCs w:val="21"/>
+        </w:rPr>
+      </w:pPr>
+      <w:r>
+        <w:rPr>
+          <w:rFonts w:ascii="Consolas" w:hAnsi="Consolas"/>
+          <w:color w:val="CCCCCC"/>
+          <w:sz w:val="21"/>
+          <w:szCs w:val="21"/>
+        </w:rPr>
+        <w:t xml:space="preserve">                </w:t>
+      </w:r>
+      <w:proofErr w:type="gramStart"/>
+      <w:r>
+        <w:rPr>
+          <w:rFonts w:ascii="Consolas" w:hAnsi="Consolas"/>
+          <w:color w:val="CCCCCC"/>
+          <w:sz w:val="21"/>
+          <w:szCs w:val="21"/>
+        </w:rPr>
+        <w:t>.</w:t>
+      </w:r>
+      <w:proofErr w:type="spellStart"/>
+      <w:r>
+        <w:rPr>
+          <w:rFonts w:ascii="Consolas" w:hAnsi="Consolas"/>
+          <w:color w:val="DCDCAA"/>
+          <w:sz w:val="21"/>
+          <w:szCs w:val="21"/>
+        </w:rPr>
+        <w:t>withMedicationName</w:t>
+      </w:r>
+      <w:proofErr w:type="spellEnd"/>
+      <w:proofErr w:type="gramEnd"/>
+      <w:r>
+        <w:rPr>
+          <w:rFonts w:ascii="Consolas" w:hAnsi="Consolas"/>
+          <w:color w:val="CCCCCC"/>
+          <w:sz w:val="21"/>
+          <w:szCs w:val="21"/>
+        </w:rPr>
+        <w:t>(</w:t>
+      </w:r>
+      <w:r>
+        <w:rPr>
+          <w:rFonts w:ascii="Consolas" w:hAnsi="Consolas"/>
+          <w:color w:val="CE9178"/>
+          <w:sz w:val="21"/>
+          <w:szCs w:val="21"/>
+        </w:rPr>
+        <w:t>"</w:t>
+      </w:r>
+      <w:proofErr w:type="spellStart"/>
+      <w:r>
+        <w:rPr>
+          <w:rFonts w:ascii="Consolas" w:hAnsi="Consolas"/>
+          <w:color w:val="CE9178"/>
+          <w:sz w:val="21"/>
+          <w:szCs w:val="21"/>
+        </w:rPr>
+        <w:t>Aspirin</w:t>
+      </w:r>
+      <w:proofErr w:type="spellEnd"/>
+      <w:r>
+        <w:rPr>
+          <w:rFonts w:ascii="Consolas" w:hAnsi="Consolas"/>
+          <w:color w:val="CE9178"/>
+          <w:sz w:val="21"/>
+          <w:szCs w:val="21"/>
+        </w:rPr>
+        <w:t>"</w:t>
+      </w:r>
+      <w:r>
+        <w:rPr>
+          <w:rFonts w:ascii="Consolas" w:hAnsi="Consolas"/>
+          <w:color w:val="CCCCCC"/>
+          <w:sz w:val="21"/>
+          <w:szCs w:val="21"/>
+        </w:rPr>
+        <w:t>)</w:t>
+      </w:r>
+    </w:p>
+    <w:p>
+      <w:pPr>
+        <w:pStyle w:val="Prrafodelista"/>
+        <w:numPr>
+          <w:ilvl w:val="0"/>
+          <w:numId w:val="19"/>
+        </w:numPr>
+        <w:shd w:val="clear" w:color="auto" w:fill="1F1F1F"/>
+        <w:spacing w:line="285" w:lineRule="atLeast"/>
+        <w:rPr>
+          <w:rFonts w:ascii="Consolas" w:hAnsi="Consolas"/>
+          <w:color w:val="CCCCCC"/>
+          <w:sz w:val="21"/>
+          <w:szCs w:val="21"/>
+        </w:rPr>
+      </w:pPr>
+      <w:r>
+        <w:rPr>
+          <w:rFonts w:ascii="Consolas" w:hAnsi="Consolas"/>
+          <w:color w:val="CCCCCC"/>
+          <w:sz w:val="21"/>
+          <w:szCs w:val="21"/>
+        </w:rPr>
+        <w:t xml:space="preserve">                </w:t>
+      </w:r>
+      <w:proofErr w:type="gramStart"/>
+      <w:r>
+        <w:rPr>
+          <w:rFonts w:ascii="Consolas" w:hAnsi="Consolas"/>
+          <w:color w:val="CCCCCC"/>
+          <w:sz w:val="21"/>
+          <w:szCs w:val="21"/>
+        </w:rPr>
+        <w:t>.</w:t>
+      </w:r>
+      <w:proofErr w:type="spellStart"/>
+      <w:r>
+        <w:rPr>
+          <w:rFonts w:ascii="Consolas" w:hAnsi="Consolas"/>
+          <w:color w:val="DCDCAA"/>
+          <w:sz w:val="21"/>
+          <w:szCs w:val="21"/>
+        </w:rPr>
+        <w:t>withDose</w:t>
+      </w:r>
+      <w:proofErr w:type="spellEnd"/>
+      <w:proofErr w:type="gramEnd"/>
+      <w:r>
+        <w:rPr>
+          <w:rFonts w:ascii="Consolas" w:hAnsi="Consolas"/>
+          <w:color w:val="CCCCCC"/>
+          <w:sz w:val="21"/>
+          <w:szCs w:val="21"/>
+        </w:rPr>
+        <w:t>(</w:t>
+      </w:r>
+      <w:r>
+        <w:rPr>
+          <w:rFonts w:ascii="Consolas" w:hAnsi="Consolas"/>
+          <w:color w:val="CE9178"/>
+          <w:sz w:val="21"/>
+          <w:szCs w:val="21"/>
+        </w:rPr>
+        <w:t>"100mg"</w:t>
+      </w:r>
+      <w:r>
+        <w:rPr>
+          <w:rFonts w:ascii="Consolas" w:hAnsi="Consolas"/>
+          <w:color w:val="CCCCCC"/>
+          <w:sz w:val="21"/>
+          <w:szCs w:val="21"/>
+        </w:rPr>
+        <w:t>)</w:t>
+      </w:r>
+    </w:p>
+    <w:p>
+      <w:pPr>
+        <w:pStyle w:val="Prrafodelista"/>
+        <w:numPr>
+          <w:ilvl w:val="0"/>
+          <w:numId w:val="19"/>
+        </w:numPr>
+        <w:shd w:val="clear" w:color="auto" w:fill="1F1F1F"/>
+        <w:spacing w:line="285" w:lineRule="atLeast"/>
+        <w:rPr>
+          <w:rFonts w:ascii="Consolas" w:hAnsi="Consolas"/>
+          <w:color w:val="CCCCCC"/>
+          <w:sz w:val="21"/>
+          <w:szCs w:val="21"/>
+        </w:rPr>
+      </w:pPr>
+      <w:r>
+        <w:rPr>
+          <w:rFonts w:ascii="Consolas" w:hAnsi="Consolas"/>
+          <w:color w:val="CCCCCC"/>
+          <w:sz w:val="21"/>
+          <w:szCs w:val="21"/>
+        </w:rPr>
+        <w:t xml:space="preserve">                </w:t>
+      </w:r>
+      <w:proofErr w:type="gramStart"/>
+      <w:r>
+        <w:rPr>
+          <w:rFonts w:ascii="Consolas" w:hAnsi="Consolas"/>
+          <w:color w:val="CCCCCC"/>
+          <w:sz w:val="21"/>
+          <w:szCs w:val="21"/>
+        </w:rPr>
+        <w:t>.</w:t>
+      </w:r>
+      <w:proofErr w:type="spellStart"/>
+      <w:r>
+        <w:rPr>
+          <w:rFonts w:ascii="Consolas" w:hAnsi="Consolas"/>
+          <w:color w:val="DCDCAA"/>
+          <w:sz w:val="21"/>
+          <w:szCs w:val="21"/>
+        </w:rPr>
+        <w:t>withFrequency</w:t>
+      </w:r>
+      <w:proofErr w:type="spellEnd"/>
+      <w:proofErr w:type="gramEnd"/>
+      <w:r>
+        <w:rPr>
+          <w:rFonts w:ascii="Consolas" w:hAnsi="Consolas"/>
+          <w:color w:val="CCCCCC"/>
+          <w:sz w:val="21"/>
+          <w:szCs w:val="21"/>
+        </w:rPr>
+        <w:t>(</w:t>
+      </w:r>
+      <w:r>
+        <w:rPr>
+          <w:rFonts w:ascii="Consolas" w:hAnsi="Consolas"/>
+          <w:color w:val="CE9178"/>
+          <w:sz w:val="21"/>
+          <w:szCs w:val="21"/>
+        </w:rPr>
+        <w:t>"</w:t>
+      </w:r>
+      <w:proofErr w:type="spellStart"/>
+      <w:r>
+        <w:rPr>
+          <w:rFonts w:ascii="Consolas" w:hAnsi="Consolas"/>
+          <w:color w:val="CE9178"/>
+          <w:sz w:val="21"/>
+          <w:szCs w:val="21"/>
+        </w:rPr>
+        <w:t>daily</w:t>
+      </w:r>
+      <w:proofErr w:type="spellEnd"/>
+      <w:r>
+        <w:rPr>
+          <w:rFonts w:ascii="Consolas" w:hAnsi="Consolas"/>
+          <w:color w:val="CE9178"/>
+          <w:sz w:val="21"/>
+          <w:szCs w:val="21"/>
+        </w:rPr>
+        <w:t>"</w:t>
+      </w:r>
+      <w:r>
+        <w:rPr>
+          <w:rFonts w:ascii="Consolas" w:hAnsi="Consolas"/>
+          <w:color w:val="CCCCCC"/>
+          <w:sz w:val="21"/>
+          <w:szCs w:val="21"/>
+        </w:rPr>
+        <w:t>)</w:t>
+      </w:r>
+    </w:p>
+    <w:p>
+      <w:pPr>
+        <w:pStyle w:val="Prrafodelista"/>
+        <w:numPr>
+          <w:ilvl w:val="0"/>
+          <w:numId w:val="19"/>
+        </w:numPr>
+        <w:shd w:val="clear" w:color="auto" w:fill="1F1F1F"/>
+        <w:spacing w:line="285" w:lineRule="atLeast"/>
+        <w:rPr>
+          <w:rFonts w:ascii="Consolas" w:hAnsi="Consolas"/>
+          <w:color w:val="CCCCCC"/>
+          <w:sz w:val="21"/>
+          <w:szCs w:val="21"/>
+        </w:rPr>
+      </w:pPr>
+      <w:r>
+        <w:rPr>
+          <w:rFonts w:ascii="Consolas" w:hAnsi="Consolas"/>
+          <w:color w:val="CCCCCC"/>
+          <w:sz w:val="21"/>
+          <w:szCs w:val="21"/>
+        </w:rPr>
+        <w:t xml:space="preserve">                </w:t>
+      </w:r>
+      <w:proofErr w:type="gramStart"/>
+      <w:r>
+        <w:rPr>
+          <w:rFonts w:ascii="Consolas" w:hAnsi="Consolas"/>
+          <w:color w:val="CCCCCC"/>
+          <w:sz w:val="21"/>
+          <w:szCs w:val="21"/>
+        </w:rPr>
+        <w:t>.</w:t>
+      </w:r>
+      <w:proofErr w:type="spellStart"/>
+      <w:r>
+        <w:rPr>
+          <w:rFonts w:ascii="Consolas" w:hAnsi="Consolas"/>
+          <w:color w:val="DCDCAA"/>
+          <w:sz w:val="21"/>
+          <w:szCs w:val="21"/>
+        </w:rPr>
+        <w:t>withStartDate</w:t>
+      </w:r>
+      <w:proofErr w:type="spellEnd"/>
+      <w:proofErr w:type="gramEnd"/>
+      <w:r>
+        <w:rPr>
+          <w:rFonts w:ascii="Consolas" w:hAnsi="Consolas"/>
+          <w:color w:val="CCCCCC"/>
+          <w:sz w:val="21"/>
+          <w:szCs w:val="21"/>
+        </w:rPr>
+        <w:t>(</w:t>
+      </w:r>
+      <w:proofErr w:type="spellStart"/>
+      <w:r>
+        <w:rPr>
+          <w:rFonts w:ascii="Consolas" w:hAnsi="Consolas"/>
+          <w:color w:val="4EC9B0"/>
+          <w:sz w:val="21"/>
+          <w:szCs w:val="21"/>
+        </w:rPr>
+        <w:t>LocalDate</w:t>
+      </w:r>
+      <w:r>
+        <w:rPr>
+          <w:rFonts w:ascii="Consolas" w:hAnsi="Consolas"/>
+          <w:color w:val="CCCCCC"/>
+          <w:sz w:val="21"/>
+          <w:szCs w:val="21"/>
+        </w:rPr>
+        <w:t>.</w:t>
+      </w:r>
+      <w:r>
+        <w:rPr>
+          <w:rFonts w:ascii="Consolas" w:hAnsi="Consolas"/>
+          <w:color w:val="DCDCAA"/>
+          <w:sz w:val="21"/>
+          <w:szCs w:val="21"/>
+        </w:rPr>
+        <w:t>now</w:t>
+      </w:r>
+      <w:proofErr w:type="spellEnd"/>
+      <w:r>
+        <w:rPr>
+          <w:rFonts w:ascii="Consolas" w:hAnsi="Consolas"/>
+          <w:color w:val="CCCCCC"/>
+          <w:sz w:val="21"/>
+          <w:szCs w:val="21"/>
+        </w:rPr>
+        <w:t>())</w:t>
+      </w:r>
+    </w:p>
+    <w:p>
+      <w:pPr>
+        <w:pStyle w:val="Prrafodelista"/>
+        <w:numPr>
+          <w:ilvl w:val="0"/>
+          <w:numId w:val="19"/>
+        </w:numPr>
+        <w:shd w:val="clear" w:color="auto" w:fill="1F1F1F"/>
+        <w:spacing w:line="285" w:lineRule="atLeast"/>
+        <w:rPr>
+          <w:rFonts w:ascii="Consolas" w:hAnsi="Consolas"/>
+          <w:color w:val="CCCCCC"/>
+          <w:sz w:val="21"/>
+          <w:szCs w:val="21"/>
+        </w:rPr>
+      </w:pPr>
+      <w:r>
+        <w:rPr>
+          <w:rFonts w:ascii="Consolas" w:hAnsi="Consolas"/>
+          <w:color w:val="CCCCCC"/>
+          <w:sz w:val="21"/>
+          <w:szCs w:val="21"/>
+        </w:rPr>
+        <w:t xml:space="preserve">                </w:t>
+      </w:r>
+      <w:proofErr w:type="gramStart"/>
+      <w:r>
+        <w:rPr>
+          <w:rFonts w:ascii="Consolas" w:hAnsi="Consolas"/>
+          <w:color w:val="CCCCCC"/>
+          <w:sz w:val="21"/>
+          <w:szCs w:val="21"/>
+        </w:rPr>
+        <w:t>.</w:t>
+      </w:r>
+      <w:proofErr w:type="spellStart"/>
+      <w:r>
+        <w:rPr>
+          <w:rFonts w:ascii="Consolas" w:hAnsi="Consolas"/>
+          <w:color w:val="DCDCAA"/>
+          <w:sz w:val="21"/>
+          <w:szCs w:val="21"/>
+        </w:rPr>
+        <w:t>build</w:t>
+      </w:r>
+      <w:proofErr w:type="spellEnd"/>
+      <w:proofErr w:type="gramEnd"/>
+      <w:r>
+        <w:rPr>
+          <w:rFonts w:ascii="Consolas" w:hAnsi="Consolas"/>
+          <w:color w:val="CCCCCC"/>
+          <w:sz w:val="21"/>
+          <w:szCs w:val="21"/>
+        </w:rPr>
+        <w:t>();</w:t>
+      </w:r>
+    </w:p>
+    <w:p>
+      <w:pPr>
+        <w:pStyle w:val="Prrafodelista"/>
+        <w:numPr>
+          <w:ilvl w:val="0"/>
+          <w:numId w:val="19"/>
+        </w:numPr>
+        <w:shd w:val="clear" w:color="auto" w:fill="1F1F1F"/>
+        <w:spacing w:line="285" w:lineRule="atLeast"/>
+        <w:rPr>
+          <w:rFonts w:ascii="Consolas" w:hAnsi="Consolas"/>
+          <w:color w:val="CCCCCC"/>
+          <w:sz w:val="21"/>
+          <w:szCs w:val="21"/>
+        </w:rPr>
+      </w:pPr>
+    </w:p>
+    <w:p>
+      <w:pPr>
+        <w:pStyle w:val="Prrafodelista"/>
+        <w:numPr>
+          <w:ilvl w:val="0"/>
+          <w:numId w:val="19"/>
+        </w:numPr>
+        <w:shd w:val="clear" w:color="auto" w:fill="1F1F1F"/>
+        <w:spacing w:line="285" w:lineRule="atLeast"/>
+        <w:rPr>
+          <w:rFonts w:ascii="Consolas" w:hAnsi="Consolas"/>
+          <w:color w:val="CCCCCC"/>
+          <w:sz w:val="21"/>
+          <w:szCs w:val="21"/>
+        </w:rPr>
+      </w:pPr>
+      <w:r>
+        <w:rPr>
+          <w:rFonts w:ascii="Consolas" w:hAnsi="Consolas"/>
+          <w:color w:val="CCCCCC"/>
+          <w:sz w:val="21"/>
+          <w:szCs w:val="21"/>
+        </w:rPr>
+        <w:t xml:space="preserve">        </w:t>
+      </w:r>
+      <w:r>
+        <w:rPr>
+          <w:rFonts w:ascii="Consolas" w:hAnsi="Consolas"/>
+          <w:color w:val="C586C0"/>
+          <w:sz w:val="21"/>
+          <w:szCs w:val="21"/>
+        </w:rPr>
+        <w:t>return</w:t>
+      </w:r>
+      <w:r>
+        <w:rPr>
+          <w:rFonts w:ascii="Consolas" w:hAnsi="Consolas"/>
+          <w:color w:val="CCCCCC"/>
+          <w:sz w:val="21"/>
+          <w:szCs w:val="21"/>
+        </w:rPr>
+        <w:t xml:space="preserve"> </w:t>
+      </w:r>
+      <w:proofErr w:type="spellStart"/>
+      <w:r>
+        <w:rPr>
+          <w:rFonts w:ascii="Consolas" w:hAnsi="Consolas"/>
+          <w:color w:val="4FC1FF"/>
+          <w:sz w:val="21"/>
+          <w:szCs w:val="21"/>
+        </w:rPr>
+        <w:t>prescriptionRepository</w:t>
+      </w:r>
+      <w:r>
+        <w:rPr>
+          <w:rFonts w:ascii="Consolas" w:hAnsi="Consolas"/>
+          <w:color w:val="CCCCCC"/>
+          <w:sz w:val="21"/>
+          <w:szCs w:val="21"/>
+        </w:rPr>
+        <w:t>.</w:t>
+      </w:r>
+      <w:r>
+        <w:rPr>
+          <w:rFonts w:ascii="Consolas" w:hAnsi="Consolas"/>
+          <w:color w:val="DCDCAA"/>
+          <w:sz w:val="21"/>
+          <w:szCs w:val="21"/>
+        </w:rPr>
+        <w:t>save</w:t>
+      </w:r>
+      <w:proofErr w:type="spellEnd"/>
+      <w:r>
+        <w:rPr>
+          <w:rFonts w:ascii="Consolas" w:hAnsi="Consolas"/>
+          <w:color w:val="CCCCCC"/>
+          <w:sz w:val="21"/>
+          <w:szCs w:val="21"/>
+        </w:rPr>
+        <w:t>(</w:t>
+      </w:r>
+      <w:proofErr w:type="spellStart"/>
+      <w:r>
+        <w:rPr>
+          <w:rFonts w:ascii="Consolas" w:hAnsi="Consolas"/>
+          <w:color w:val="9CDCFE"/>
+          <w:sz w:val="21"/>
+          <w:szCs w:val="21"/>
+        </w:rPr>
+        <w:t>prescription</w:t>
+      </w:r>
+      <w:proofErr w:type="spellEnd"/>
+      <w:r>
+        <w:rPr>
+          <w:rFonts w:ascii="Consolas" w:hAnsi="Consolas"/>
+          <w:color w:val="CCCCCC"/>
+          <w:sz w:val="21"/>
+          <w:szCs w:val="21"/>
+        </w:rPr>
+        <w:t>);</w:t>
+      </w:r>
+    </w:p>
+    <w:p>
+      <w:pPr>
+        <w:pStyle w:val="Prrafodelista"/>
+        <w:numPr>
+          <w:ilvl w:val="0"/>
+          <w:numId w:val="19"/>
+        </w:numPr>
+        <w:shd w:val="clear" w:color="auto" w:fill="1F1F1F"/>
+        <w:spacing w:line="285" w:lineRule="atLeast"/>
+        <w:rPr>
+          <w:rFonts w:ascii="Consolas" w:hAnsi="Consolas"/>
+          <w:color w:val="CCCCCC"/>
+          <w:sz w:val="21"/>
+          <w:szCs w:val="21"/>
+        </w:rPr>
+      </w:pPr>
+      <w:r>
+        <w:rPr>
+          <w:rFonts w:ascii="Consolas" w:hAnsi="Consolas"/>
+          <w:color w:val="CCCCCC"/>
+          <w:sz w:val="21"/>
+          <w:szCs w:val="21"/>
+        </w:rPr>
+        <w:t>    }</w:t>
+      </w:r>
+    </w:p>
+    <w:p>
+      <w:pPr>
+        <w:pStyle w:val="Prrafodelista"/>
+        <w:numPr>
+          <w:ilvl w:val="0"/>
+          <w:numId w:val="19"/>
+        </w:numPr>
+        <w:shd w:val="clear" w:color="auto" w:fill="1F1F1F"/>
+        <w:spacing w:line="285" w:lineRule="atLeast"/>
+        <w:rPr>
+          <w:rFonts w:ascii="Consolas" w:hAnsi="Consolas"/>
+          <w:color w:val="CCCCCC"/>
+          <w:sz w:val="21"/>
+          <w:szCs w:val="21"/>
+        </w:rPr>
+      </w:pPr>
+      <w:r>
+        <w:rPr>
+          <w:rFonts w:ascii="Consolas" w:hAnsi="Consolas"/>
+          <w:color w:val="CCCCCC"/>
+          <w:sz w:val="21"/>
+          <w:szCs w:val="21"/>
+        </w:rPr>
+        <w:t>}</w:t>
+      </w:r>
+    </w:p>
+    <w:p/>
+    <w:p>
+      <w:pPr>
+        <w:pStyle w:val="Prrafodelista"/>
+        <w:numPr>
+          <w:ilvl w:val="0"/>
+          <w:numId w:val="26"/>
+        </w:numPr>
+        <w:spacing w:line="480" w:lineRule="auto"/>
+        <w:jc w:val="both"/>
+      </w:pPr>
+      <w:r>
+        <w:rPr>
+          <w:rFonts w:cs="Arial"/>
+          <w:b/>
+          <w:bCs/>
+        </w:rPr>
+        <w:t>Explicación</w:t>
+      </w:r>
+      <w:r>
+        <w:rPr>
+          <w:rFonts w:cs="Arial"/>
+          <w:b/>
+          <w:bCs/>
+        </w:rPr>
+        <w:t xml:space="preserve">: </w:t>
+      </w:r>
+      <w:r>
+        <w:t xml:space="preserve">Implementé el patrón </w:t>
+      </w:r>
+      <w:proofErr w:type="spellStart"/>
+      <w:r>
+        <w:rPr>
+          <w:b/>
+          <w:bCs/>
+        </w:rPr>
+        <w:t>Builder</w:t>
+      </w:r>
+      <w:proofErr w:type="spellEnd"/>
+      <w:r>
+        <w:t xml:space="preserve"> para construir objetos </w:t>
+      </w:r>
+      <w:proofErr w:type="spellStart"/>
+      <w:r>
+        <w:rPr>
+          <w:b/>
+          <w:bCs/>
+        </w:rPr>
+        <w:t>Prescription</w:t>
+      </w:r>
+      <w:proofErr w:type="spellEnd"/>
+      <w:r>
+        <w:t xml:space="preserve"> paso a paso.</w:t>
+      </w:r>
+      <w:r>
+        <w:t xml:space="preserve"> </w:t>
+      </w:r>
+      <w:r>
+        <w:t xml:space="preserve">En lugar de usar muchos </w:t>
+      </w:r>
+      <w:proofErr w:type="gramStart"/>
+      <w:r>
+        <w:rPr>
+          <w:b/>
+          <w:bCs/>
+        </w:rPr>
+        <w:t>set(</w:t>
+      </w:r>
+      <w:proofErr w:type="gramEnd"/>
+      <w:r>
+        <w:rPr>
+          <w:b/>
+          <w:bCs/>
+        </w:rPr>
+        <w:t>)</w:t>
+      </w:r>
+      <w:r>
+        <w:t xml:space="preserve"> que hacen el código difícil de leer, uso </w:t>
+      </w:r>
+      <w:proofErr w:type="spellStart"/>
+      <w:r>
+        <w:rPr>
+          <w:b/>
+          <w:bCs/>
+        </w:rPr>
+        <w:t>PrescriptionBuilder</w:t>
+      </w:r>
+      <w:proofErr w:type="spellEnd"/>
+      <w:r>
+        <w:t xml:space="preserve"> que permite construir la receta de forma fluida con métodos como </w:t>
+      </w:r>
+      <w:proofErr w:type="spellStart"/>
+      <w:r>
+        <w:rPr>
+          <w:b/>
+          <w:bCs/>
+        </w:rPr>
+        <w:t>withMedicationName</w:t>
+      </w:r>
+      <w:proofErr w:type="spellEnd"/>
+      <w:r>
+        <w:t xml:space="preserve">, </w:t>
+      </w:r>
+      <w:proofErr w:type="spellStart"/>
+      <w:r>
+        <w:rPr>
+          <w:b/>
+          <w:bCs/>
+        </w:rPr>
+        <w:t>withDose</w:t>
+      </w:r>
+      <w:proofErr w:type="spellEnd"/>
+      <w:r>
+        <w:t xml:space="preserve"> y </w:t>
+      </w:r>
+      <w:r>
+        <w:lastRenderedPageBreak/>
+        <w:t xml:space="preserve">finalmente </w:t>
+      </w:r>
+      <w:proofErr w:type="spellStart"/>
+      <w:r>
+        <w:rPr>
+          <w:b/>
+          <w:bCs/>
+        </w:rPr>
+        <w:t>build</w:t>
+      </w:r>
+      <w:proofErr w:type="spellEnd"/>
+      <w:r>
+        <w:rPr>
+          <w:b/>
+          <w:bCs/>
+        </w:rPr>
+        <w:t>().</w:t>
+      </w:r>
+      <w:r>
+        <w:t xml:space="preserve"> </w:t>
+      </w:r>
+      <w:r>
+        <w:t>Esto hace el código más claro y reduce errores cuando una entidad tiene muchos campos.</w:t>
+      </w:r>
+    </w:p>
+    <w:p>
+      <w:pPr>
+        <w:pStyle w:val="Ttulo1"/>
+        <w:ind w:firstLine="360"/>
+      </w:pPr>
+      <w:bookmarkStart w:id="15" w:name="_Toc224386499"/>
+      <w:r>
+        <w:t>4.3</w:t>
+      </w:r>
+      <w:r>
+        <w:t>.</w:t>
+      </w:r>
+      <w:r>
+        <w:t xml:space="preserve"> Diagrama UML</w:t>
+      </w:r>
+      <w:bookmarkEnd w:id="15"/>
+    </w:p>
+    <w:p>
+      <w:pPr>
+        <w:rPr>
+          <w:rFonts w:ascii="Consolas" w:hAnsi="Consolas"/>
+          <w:sz w:val="21"/>
+          <w:szCs w:val="21"/>
+        </w:rPr>
+      </w:pPr>
+      <w:r>
+        <w:rPr>
+          <w:noProof/>
+        </w:rPr>
+        <w:drawing>
+          <wp:inline distT="0" distB="0" distL="0" distR="0">
+            <wp:extent cx="5612130" cy="3876040"/>
+            <wp:effectExtent l="0" t="0" r="7620" b="0"/>
+            <wp:docPr id="404872833" name="Imagen 1" descr="PlantUML Diagram"/>
+            <wp:cNvGraphicFramePr>
+              <a:graphicFrameLocks xmlns:a="http://schemas.openxmlformats.org/drawingml/2006/main" noChangeAspect="1"/>
+            </wp:cNvGraphicFramePr>
+            <a:graphic xmlns:a="http://schemas.openxmlformats.org/drawingml/2006/main">
+              <a:graphicData uri="http://schemas.openxmlformats.org/drawingml/2006/picture">
+                <pic:pic xmlns:pic="http://schemas.openxmlformats.org/drawingml/2006/picture">
+                  <pic:nvPicPr>
+                    <pic:cNvPr id="0" name="Picture 1" descr="PlantUML Diagram"/>
+                    <pic:cNvPicPr>
+                      <a:picLocks noChangeAspect="1" noChangeArrowheads="1"/>
+                    </pic:cNvPicPr>
+                  </pic:nvPicPr>
+                  <pic:blipFill>
+                    <a:blip r:embed="rId13">
+                      <a:extLst>
+                        <a:ext uri="{28A0092B-C50C-407E-A947-70E740481C1C}">
+                          <a14:useLocalDpi xmlns:a14="http://schemas.microsoft.com/office/drawing/2010/main" val="0"/>
+                        </a:ext>
+                      </a:extLst>
+                    </a:blip>
+                    <a:srcRect/>
+                    <a:stretch>
+                      <a:fillRect/>
+                    </a:stretch>
+                  </pic:blipFill>
+                  <pic:spPr bwMode="auto">
+                    <a:xfrm>
+                      <a:off x="0" y="0"/>
+                      <a:ext cx="5612130" cy="3876040"/>
+                    </a:xfrm>
+                    <a:prstGeom prst="rect">
+                      <a:avLst/>
+                    </a:prstGeom>
+                    <a:noFill/>
+                    <a:ln>
+                      <a:noFill/>
+                    </a:ln>
+                  </pic:spPr>
+                </pic:pic>
+              </a:graphicData>
+            </a:graphic>
+          </wp:inline>
+        </w:drawing>
+      </w:r>
+    </w:p>
+    <w:p>
+      <w:pPr>
+        <w:rPr>
+          <w:rFonts w:ascii="Consolas" w:hAnsi="Consolas"/>
+          <w:sz w:val="21"/>
+          <w:szCs w:val="21"/>
+        </w:rPr>
+      </w:pPr>
+    </w:p>
     <w:sectPr>
-      <w:footerReference w:type="default" r:id="rId13"/>
+      <w:footerReference w:type="default" r:id="rId14"/>
       <w:pgSz w:w="12240" w:h="15840"/>
       <w:pgMar w:top="1418" w:right="1701" w:bottom="1418" w:left="1701" w:header="709" w:footer="709" w:gutter="0"/>
       <w:pgNumType w:start="0"/>
@@ -22827,7 +25705,7 @@
         <w:rFonts w:ascii="Wingdings" w:hAnsi="Wingdings" w:hint="default"/>
       </w:rPr>
     </w:lvl>
-    <w:lvl w:ilvl="1" w:tplc="240A0003" w:tentative="1">
+    <w:lvl w:ilvl="1" w:tplc="240A0003">
       <w:start w:val="1"/>
       <w:numFmt w:val="bullet"/>
       <w:lvlText w:val="o"/>
@@ -23458,6 +26336,92 @@
     </w:lvl>
   </w:abstractNum>
   <w:abstractNum w:abstractNumId="5" w15:restartNumberingAfterBreak="0">
+    <w:nsid w:val="0FEF7444"/>
+    <w:multiLevelType w:val="hybridMultilevel"/>
+    <w:tmpl w:val="69EE44BE"/>
+    <w:lvl w:ilvl="0" w:tplc="240A000F">
+      <w:start w:val="1"/>
+      <w:numFmt w:val="decimal"/>
+      <w:lvlText w:val="%1."/>
+      <w:lvlJc w:val="left"/>
+      <w:pPr>
+        <w:ind w:left="720" w:hanging="360"/>
+      </w:pPr>
+    </w:lvl>
+    <w:lvl w:ilvl="1" w:tplc="240A0019" w:tentative="1">
+      <w:start w:val="1"/>
+      <w:numFmt w:val="lowerLetter"/>
+      <w:lvlText w:val="%2."/>
+      <w:lvlJc w:val="left"/>
+      <w:pPr>
+        <w:ind w:left="1440" w:hanging="360"/>
+      </w:pPr>
+    </w:lvl>
+    <w:lvl w:ilvl="2" w:tplc="240A001B" w:tentative="1">
+      <w:start w:val="1"/>
+      <w:numFmt w:val="lowerRoman"/>
+      <w:lvlText w:val="%3."/>
+      <w:lvlJc w:val="right"/>
+      <w:pPr>
+        <w:ind w:left="2160" w:hanging="180"/>
+      </w:pPr>
+    </w:lvl>
+    <w:lvl w:ilvl="3" w:tplc="240A000F" w:tentative="1">
+      <w:start w:val="1"/>
+      <w:numFmt w:val="decimal"/>
+      <w:lvlText w:val="%4."/>
+      <w:lvlJc w:val="left"/>
+      <w:pPr>
+        <w:ind w:left="2880" w:hanging="360"/>
+      </w:pPr>
+    </w:lvl>
+    <w:lvl w:ilvl="4" w:tplc="240A0019" w:tentative="1">
+      <w:start w:val="1"/>
+      <w:numFmt w:val="lowerLetter"/>
+      <w:lvlText w:val="%5."/>
+      <w:lvlJc w:val="left"/>
+      <w:pPr>
+        <w:ind w:left="3600" w:hanging="360"/>
+      </w:pPr>
+    </w:lvl>
+    <w:lvl w:ilvl="5" w:tplc="240A001B" w:tentative="1">
+      <w:start w:val="1"/>
+      <w:numFmt w:val="lowerRoman"/>
+      <w:lvlText w:val="%6."/>
+      <w:lvlJc w:val="right"/>
+      <w:pPr>
+        <w:ind w:left="4320" w:hanging="180"/>
+      </w:pPr>
+    </w:lvl>
+    <w:lvl w:ilvl="6" w:tplc="240A000F" w:tentative="1">
+      <w:start w:val="1"/>
+      <w:numFmt w:val="decimal"/>
+      <w:lvlText w:val="%7."/>
+      <w:lvlJc w:val="left"/>
+      <w:pPr>
+        <w:ind w:left="5040" w:hanging="360"/>
+      </w:pPr>
+    </w:lvl>
+    <w:lvl w:ilvl="7" w:tplc="240A0019" w:tentative="1">
+      <w:start w:val="1"/>
+      <w:numFmt w:val="lowerLetter"/>
+      <w:lvlText w:val="%8."/>
+      <w:lvlJc w:val="left"/>
+      <w:pPr>
+        <w:ind w:left="5760" w:hanging="360"/>
+      </w:pPr>
+    </w:lvl>
+    <w:lvl w:ilvl="8" w:tplc="240A001B" w:tentative="1">
+      <w:start w:val="1"/>
+      <w:numFmt w:val="lowerRoman"/>
+      <w:lvlText w:val="%9."/>
+      <w:lvlJc w:val="right"/>
+      <w:pPr>
+        <w:ind w:left="6480" w:hanging="180"/>
+      </w:pPr>
+    </w:lvl>
+  </w:abstractNum>
+  <w:abstractNum w:abstractNumId="6" w15:restartNumberingAfterBreak="0">
     <w:nsid w:val="12284328"/>
     <w:multiLevelType w:val="hybridMultilevel"/>
     <w:tmpl w:val="8FE00700"/>
@@ -23570,7 +26534,7 @@
       </w:rPr>
     </w:lvl>
   </w:abstractNum>
-  <w:abstractNum w:abstractNumId="6" w15:restartNumberingAfterBreak="0">
+  <w:abstractNum w:abstractNumId="7" w15:restartNumberingAfterBreak="0">
     <w:nsid w:val="136C4E80"/>
     <w:multiLevelType w:val="hybridMultilevel"/>
     <w:tmpl w:val="47A84992"/>
@@ -23683,7 +26647,7 @@
       </w:rPr>
     </w:lvl>
   </w:abstractNum>
-  <w:abstractNum w:abstractNumId="7" w15:restartNumberingAfterBreak="0">
+  <w:abstractNum w:abstractNumId="8" w15:restartNumberingAfterBreak="0">
     <w:nsid w:val="199E6647"/>
     <w:multiLevelType w:val="multilevel"/>
     <w:tmpl w:val="E47AC9C8"/>
@@ -23796,7 +26760,7 @@
       </w:pPr>
     </w:lvl>
   </w:abstractNum>
-  <w:abstractNum w:abstractNumId="8" w15:restartNumberingAfterBreak="0">
+  <w:abstractNum w:abstractNumId="9" w15:restartNumberingAfterBreak="0">
     <w:nsid w:val="1CB4664B"/>
     <w:multiLevelType w:val="multilevel"/>
     <w:tmpl w:val="1B26F646"/>
@@ -23945,7 +26909,7 @@
       </w:rPr>
     </w:lvl>
   </w:abstractNum>
-  <w:abstractNum w:abstractNumId="9" w15:restartNumberingAfterBreak="0">
+  <w:abstractNum w:abstractNumId="10" w15:restartNumberingAfterBreak="0">
     <w:nsid w:val="1F3A2F55"/>
     <w:multiLevelType w:val="multilevel"/>
     <w:tmpl w:val="0BF0464A"/>
@@ -24094,7 +27058,7 @@
       </w:rPr>
     </w:lvl>
   </w:abstractNum>
-  <w:abstractNum w:abstractNumId="10" w15:restartNumberingAfterBreak="0">
+  <w:abstractNum w:abstractNumId="11" w15:restartNumberingAfterBreak="0">
     <w:nsid w:val="2034258A"/>
     <w:multiLevelType w:val="multilevel"/>
     <w:tmpl w:val="9FE47510"/>
@@ -24243,7 +27207,7 @@
       </w:rPr>
     </w:lvl>
   </w:abstractNum>
-  <w:abstractNum w:abstractNumId="11" w15:restartNumberingAfterBreak="0">
+  <w:abstractNum w:abstractNumId="12" w15:restartNumberingAfterBreak="0">
     <w:nsid w:val="24992E16"/>
     <w:multiLevelType w:val="multilevel"/>
     <w:tmpl w:val="7DFE1608"/>
@@ -24392,7 +27356,7 @@
       </w:rPr>
     </w:lvl>
   </w:abstractNum>
-  <w:abstractNum w:abstractNumId="12" w15:restartNumberingAfterBreak="0">
+  <w:abstractNum w:abstractNumId="13" w15:restartNumberingAfterBreak="0">
     <w:nsid w:val="25A307B8"/>
     <w:multiLevelType w:val="multilevel"/>
     <w:tmpl w:val="89086B38"/>
@@ -24541,7 +27505,7 @@
       </w:rPr>
     </w:lvl>
   </w:abstractNum>
-  <w:abstractNum w:abstractNumId="13" w15:restartNumberingAfterBreak="0">
+  <w:abstractNum w:abstractNumId="14" w15:restartNumberingAfterBreak="0">
     <w:nsid w:val="3008709F"/>
     <w:multiLevelType w:val="multilevel"/>
     <w:tmpl w:val="B158EAB8"/>
@@ -24690,7 +27654,93 @@
       </w:rPr>
     </w:lvl>
   </w:abstractNum>
-  <w:abstractNum w:abstractNumId="14" w15:restartNumberingAfterBreak="0">
+  <w:abstractNum w:abstractNumId="15" w15:restartNumberingAfterBreak="0">
+    <w:nsid w:val="31247DF5"/>
+    <w:multiLevelType w:val="multilevel"/>
+    <w:tmpl w:val="240A001F"/>
+    <w:lvl w:ilvl="0">
+      <w:start w:val="1"/>
+      <w:numFmt w:val="decimal"/>
+      <w:lvlText w:val="%1."/>
+      <w:lvlJc w:val="left"/>
+      <w:pPr>
+        <w:ind w:left="360" w:hanging="360"/>
+      </w:pPr>
+    </w:lvl>
+    <w:lvl w:ilvl="1">
+      <w:start w:val="1"/>
+      <w:numFmt w:val="decimal"/>
+      <w:lvlText w:val="%1.%2."/>
+      <w:lvlJc w:val="left"/>
+      <w:pPr>
+        <w:ind w:left="792" w:hanging="432"/>
+      </w:pPr>
+    </w:lvl>
+    <w:lvl w:ilvl="2">
+      <w:start w:val="1"/>
+      <w:numFmt w:val="decimal"/>
+      <w:lvlText w:val="%1.%2.%3."/>
+      <w:lvlJc w:val="left"/>
+      <w:pPr>
+        <w:ind w:left="1224" w:hanging="504"/>
+      </w:pPr>
+    </w:lvl>
+    <w:lvl w:ilvl="3">
+      <w:start w:val="1"/>
+      <w:numFmt w:val="decimal"/>
+      <w:lvlText w:val="%1.%2.%3.%4."/>
+      <w:lvlJc w:val="left"/>
+      <w:pPr>
+        <w:ind w:left="1728" w:hanging="648"/>
+      </w:pPr>
+    </w:lvl>
+    <w:lvl w:ilvl="4">
+      <w:start w:val="1"/>
+      <w:numFmt w:val="decimal"/>
+      <w:lvlText w:val="%1.%2.%3.%4.%5."/>
+      <w:lvlJc w:val="left"/>
+      <w:pPr>
+        <w:ind w:left="2232" w:hanging="792"/>
+      </w:pPr>
+    </w:lvl>
+    <w:lvl w:ilvl="5">
+      <w:start w:val="1"/>
+      <w:numFmt w:val="decimal"/>
+      <w:lvlText w:val="%1.%2.%3.%4.%5.%6."/>
+      <w:lvlJc w:val="left"/>
+      <w:pPr>
+        <w:ind w:left="2736" w:hanging="936"/>
+      </w:pPr>
+    </w:lvl>
+    <w:lvl w:ilvl="6">
+      <w:start w:val="1"/>
+      <w:numFmt w:val="decimal"/>
+      <w:lvlText w:val="%1.%2.%3.%4.%5.%6.%7."/>
+      <w:lvlJc w:val="left"/>
+      <w:pPr>
+        <w:ind w:left="3240" w:hanging="1080"/>
+      </w:pPr>
+    </w:lvl>
+    <w:lvl w:ilvl="7">
+      <w:start w:val="1"/>
+      <w:numFmt w:val="decimal"/>
+      <w:lvlText w:val="%1.%2.%3.%4.%5.%6.%7.%8."/>
+      <w:lvlJc w:val="left"/>
+      <w:pPr>
+        <w:ind w:left="3744" w:hanging="1224"/>
+      </w:pPr>
+    </w:lvl>
+    <w:lvl w:ilvl="8">
+      <w:start w:val="1"/>
+      <w:numFmt w:val="decimal"/>
+      <w:lvlText w:val="%1.%2.%3.%4.%5.%6.%7.%8.%9."/>
+      <w:lvlJc w:val="left"/>
+      <w:pPr>
+        <w:ind w:left="4320" w:hanging="1440"/>
+      </w:pPr>
+    </w:lvl>
+  </w:abstractNum>
+  <w:abstractNum w:abstractNumId="16" w15:restartNumberingAfterBreak="0">
     <w:nsid w:val="37D9393E"/>
     <w:multiLevelType w:val="hybridMultilevel"/>
     <w:tmpl w:val="6C44FDE2"/>
@@ -24776,7 +27826,7 @@
       </w:pPr>
     </w:lvl>
   </w:abstractNum>
-  <w:abstractNum w:abstractNumId="15" w15:restartNumberingAfterBreak="0">
+  <w:abstractNum w:abstractNumId="17" w15:restartNumberingAfterBreak="0">
     <w:nsid w:val="41B6235B"/>
     <w:multiLevelType w:val="multilevel"/>
     <w:tmpl w:val="31249B58"/>
@@ -24925,7 +27975,120 @@
       </w:rPr>
     </w:lvl>
   </w:abstractNum>
-  <w:abstractNum w:abstractNumId="16" w15:restartNumberingAfterBreak="0">
+  <w:abstractNum w:abstractNumId="18" w15:restartNumberingAfterBreak="0">
+    <w:nsid w:val="542E2109"/>
+    <w:multiLevelType w:val="hybridMultilevel"/>
+    <w:tmpl w:val="4F92FBF4"/>
+    <w:lvl w:ilvl="0" w:tplc="240A0005">
+      <w:start w:val="1"/>
+      <w:numFmt w:val="bullet"/>
+      <w:lvlText w:val=""/>
+      <w:lvlJc w:val="left"/>
+      <w:pPr>
+        <w:ind w:left="720" w:hanging="360"/>
+      </w:pPr>
+      <w:rPr>
+        <w:rFonts w:ascii="Wingdings" w:hAnsi="Wingdings" w:hint="default"/>
+      </w:rPr>
+    </w:lvl>
+    <w:lvl w:ilvl="1" w:tplc="240A0003" w:tentative="1">
+      <w:start w:val="1"/>
+      <w:numFmt w:val="bullet"/>
+      <w:lvlText w:val="o"/>
+      <w:lvlJc w:val="left"/>
+      <w:pPr>
+        <w:ind w:left="1440" w:hanging="360"/>
+      </w:pPr>
+      <w:rPr>
+        <w:rFonts w:ascii="Courier New" w:hAnsi="Courier New" w:cs="Courier New" w:hint="default"/>
+      </w:rPr>
+    </w:lvl>
+    <w:lvl w:ilvl="2" w:tplc="240A0005" w:tentative="1">
+      <w:start w:val="1"/>
+      <w:numFmt w:val="bullet"/>
+      <w:lvlText w:val=""/>
+      <w:lvlJc w:val="left"/>
+      <w:pPr>
+        <w:ind w:left="2160" w:hanging="360"/>
+      </w:pPr>
+      <w:rPr>
+        <w:rFonts w:ascii="Wingdings" w:hAnsi="Wingdings" w:hint="default"/>
+      </w:rPr>
+    </w:lvl>
+    <w:lvl w:ilvl="3" w:tplc="240A0001" w:tentative="1">
+      <w:start w:val="1"/>
+      <w:numFmt w:val="bullet"/>
+      <w:lvlText w:val=""/>
+      <w:lvlJc w:val="left"/>
+      <w:pPr>
+        <w:ind w:left="2880" w:hanging="360"/>
+      </w:pPr>
+      <w:rPr>
+        <w:rFonts w:ascii="Symbol" w:hAnsi="Symbol" w:hint="default"/>
+      </w:rPr>
+    </w:lvl>
+    <w:lvl w:ilvl="4" w:tplc="240A0003" w:tentative="1">
+      <w:start w:val="1"/>
+      <w:numFmt w:val="bullet"/>
+      <w:lvlText w:val="o"/>
+      <w:lvlJc w:val="left"/>
+      <w:pPr>
+        <w:ind w:left="3600" w:hanging="360"/>
+      </w:pPr>
+      <w:rPr>
+        <w:rFonts w:ascii="Courier New" w:hAnsi="Courier New" w:cs="Courier New" w:hint="default"/>
+      </w:rPr>
+    </w:lvl>
+    <w:lvl w:ilvl="5" w:tplc="240A0005" w:tentative="1">
+      <w:start w:val="1"/>
+      <w:numFmt w:val="bullet"/>
+      <w:lvlText w:val=""/>
+      <w:lvlJc w:val="left"/>
+      <w:pPr>
+        <w:ind w:left="4320" w:hanging="360"/>
+      </w:pPr>
+      <w:rPr>
+        <w:rFonts w:ascii="Wingdings" w:hAnsi="Wingdings" w:hint="default"/>
+      </w:rPr>
+    </w:lvl>
+    <w:lvl w:ilvl="6" w:tplc="240A0001" w:tentative="1">
+      <w:start w:val="1"/>
+      <w:numFmt w:val="bullet"/>
+      <w:lvlText w:val=""/>
+      <w:lvlJc w:val="left"/>
+      <w:pPr>
+        <w:ind w:left="5040" w:hanging="360"/>
+      </w:pPr>
+      <w:rPr>
+        <w:rFonts w:ascii="Symbol" w:hAnsi="Symbol" w:hint="default"/>
+      </w:rPr>
+    </w:lvl>
+    <w:lvl w:ilvl="7" w:tplc="240A0003" w:tentative="1">
+      <w:start w:val="1"/>
+      <w:numFmt w:val="bullet"/>
+      <w:lvlText w:val="o"/>
+      <w:lvlJc w:val="left"/>
+      <w:pPr>
+        <w:ind w:left="5760" w:hanging="360"/>
+      </w:pPr>
+      <w:rPr>
+        <w:rFonts w:ascii="Courier New" w:hAnsi="Courier New" w:cs="Courier New" w:hint="default"/>
+      </w:rPr>
+    </w:lvl>
+    <w:lvl w:ilvl="8" w:tplc="240A0005" w:tentative="1">
+      <w:start w:val="1"/>
+      <w:numFmt w:val="bullet"/>
+      <w:lvlText w:val=""/>
+      <w:lvlJc w:val="left"/>
+      <w:pPr>
+        <w:ind w:left="6480" w:hanging="360"/>
+      </w:pPr>
+      <w:rPr>
+        <w:rFonts w:ascii="Wingdings" w:hAnsi="Wingdings" w:hint="default"/>
+      </w:rPr>
+    </w:lvl>
+  </w:abstractNum>
+  <w:abstractNum w:abstractNumId="19" w15:restartNumberingAfterBreak="0">
     <w:nsid w:val="57731F88"/>
     <w:multiLevelType w:val="multilevel"/>
     <w:tmpl w:val="D184402A"/>
@@ -25074,7 +28237,7 @@
       </w:rPr>
     </w:lvl>
   </w:abstractNum>
-  <w:abstractNum w:abstractNumId="17" w15:restartNumberingAfterBreak="0">
+  <w:abstractNum w:abstractNumId="20" w15:restartNumberingAfterBreak="0">
     <w:nsid w:val="5C685D3D"/>
     <w:multiLevelType w:val="multilevel"/>
     <w:tmpl w:val="6A780A1C"/>
@@ -25223,7 +28386,7 @@
       </w:rPr>
     </w:lvl>
   </w:abstractNum>
-  <w:abstractNum w:abstractNumId="18" w15:restartNumberingAfterBreak="0">
+  <w:abstractNum w:abstractNumId="21" w15:restartNumberingAfterBreak="0">
     <w:nsid w:val="5E7D3C45"/>
     <w:multiLevelType w:val="multilevel"/>
     <w:tmpl w:val="D2AE1C3A"/>
@@ -25372,7 +28535,7 @@
       </w:rPr>
     </w:lvl>
   </w:abstractNum>
-  <w:abstractNum w:abstractNumId="19" w15:restartNumberingAfterBreak="0">
+  <w:abstractNum w:abstractNumId="22" w15:restartNumberingAfterBreak="0">
     <w:nsid w:val="6B2C55EE"/>
     <w:multiLevelType w:val="multilevel"/>
     <w:tmpl w:val="BC28CA86"/>
@@ -25521,7 +28684,7 @@
       </w:rPr>
     </w:lvl>
   </w:abstractNum>
-  <w:abstractNum w:abstractNumId="20" w15:restartNumberingAfterBreak="0">
+  <w:abstractNum w:abstractNumId="23" w15:restartNumberingAfterBreak="0">
     <w:nsid w:val="6DF53076"/>
     <w:multiLevelType w:val="multilevel"/>
     <w:tmpl w:val="C676345E"/>
@@ -25634,7 +28797,7 @@
       </w:pPr>
     </w:lvl>
   </w:abstractNum>
-  <w:abstractNum w:abstractNumId="21" w15:restartNumberingAfterBreak="0">
+  <w:abstractNum w:abstractNumId="24" w15:restartNumberingAfterBreak="0">
     <w:nsid w:val="6FF71EC0"/>
     <w:multiLevelType w:val="multilevel"/>
     <w:tmpl w:val="ADCE55F4"/>
@@ -25783,10 +28946,10 @@
       </w:rPr>
     </w:lvl>
   </w:abstractNum>
-  <w:abstractNum w:abstractNumId="22" w15:restartNumberingAfterBreak="0">
-    <w:nsid w:val="78DF4B19"/>
+  <w:abstractNum w:abstractNumId="25" w15:restartNumberingAfterBreak="0">
+    <w:nsid w:val="72CD7DCE"/>
     <w:multiLevelType w:val="multilevel"/>
-    <w:tmpl w:val="8A962900"/>
+    <w:tmpl w:val="580ADB4A"/>
     <w:lvl w:ilvl="0">
       <w:start w:val="1"/>
       <w:numFmt w:val="bullet"/>
@@ -25932,10 +29095,10 @@
       </w:rPr>
     </w:lvl>
   </w:abstractNum>
-  <w:abstractNum w:abstractNumId="23" w15:restartNumberingAfterBreak="0">
-    <w:nsid w:val="7E6F458C"/>
+  <w:abstractNum w:abstractNumId="26" w15:restartNumberingAfterBreak="0">
+    <w:nsid w:val="78DF4B19"/>
     <w:multiLevelType w:val="multilevel"/>
-    <w:tmpl w:val="BD924584"/>
+    <w:tmpl w:val="8A962900"/>
     <w:lvl w:ilvl="0">
       <w:start w:val="1"/>
       <w:numFmt w:val="bullet"/>
@@ -26081,59 +29244,208 @@
       </w:rPr>
     </w:lvl>
   </w:abstractNum>
+  <w:abstractNum w:abstractNumId="27" w15:restartNumberingAfterBreak="0">
+    <w:nsid w:val="7E6F458C"/>
+    <w:multiLevelType w:val="multilevel"/>
+    <w:tmpl w:val="BD924584"/>
+    <w:lvl w:ilvl="0">
+      <w:start w:val="1"/>
+      <w:numFmt w:val="bullet"/>
+      <w:lvlText w:val=""/>
+      <w:lvlJc w:val="left"/>
+      <w:pPr>
+        <w:tabs>
+          <w:tab w:val="num" w:pos="720"/>
+        </w:tabs>
+        <w:ind w:left="720" w:hanging="360"/>
+      </w:pPr>
+      <w:rPr>
+        <w:rFonts w:ascii="Symbol" w:hAnsi="Symbol" w:hint="default"/>
+        <w:sz w:val="20"/>
+      </w:rPr>
+    </w:lvl>
+    <w:lvl w:ilvl="1" w:tentative="1">
+      <w:start w:val="1"/>
+      <w:numFmt w:val="bullet"/>
+      <w:lvlText w:val="o"/>
+      <w:lvlJc w:val="left"/>
+      <w:pPr>
+        <w:tabs>
+          <w:tab w:val="num" w:pos="1440"/>
+        </w:tabs>
+        <w:ind w:left="1440" w:hanging="360"/>
+      </w:pPr>
+      <w:rPr>
+        <w:rFonts w:ascii="Courier New" w:hAnsi="Courier New" w:hint="default"/>
+        <w:sz w:val="20"/>
+      </w:rPr>
+    </w:lvl>
+    <w:lvl w:ilvl="2" w:tentative="1">
+      <w:start w:val="1"/>
+      <w:numFmt w:val="bullet"/>
+      <w:lvlText w:val=""/>
+      <w:lvlJc w:val="left"/>
+      <w:pPr>
+        <w:tabs>
+          <w:tab w:val="num" w:pos="2160"/>
+        </w:tabs>
+        <w:ind w:left="2160" w:hanging="360"/>
+      </w:pPr>
+      <w:rPr>
+        <w:rFonts w:ascii="Wingdings" w:hAnsi="Wingdings" w:hint="default"/>
+        <w:sz w:val="20"/>
+      </w:rPr>
+    </w:lvl>
+    <w:lvl w:ilvl="3" w:tentative="1">
+      <w:start w:val="1"/>
+      <w:numFmt w:val="bullet"/>
+      <w:lvlText w:val=""/>
+      <w:lvlJc w:val="left"/>
+      <w:pPr>
+        <w:tabs>
+          <w:tab w:val="num" w:pos="2880"/>
+        </w:tabs>
+        <w:ind w:left="2880" w:hanging="360"/>
+      </w:pPr>
+      <w:rPr>
+        <w:rFonts w:ascii="Wingdings" w:hAnsi="Wingdings" w:hint="default"/>
+        <w:sz w:val="20"/>
+      </w:rPr>
+    </w:lvl>
+    <w:lvl w:ilvl="4" w:tentative="1">
+      <w:start w:val="1"/>
+      <w:numFmt w:val="bullet"/>
+      <w:lvlText w:val=""/>
+      <w:lvlJc w:val="left"/>
+      <w:pPr>
+        <w:tabs>
+          <w:tab w:val="num" w:pos="3600"/>
+        </w:tabs>
+        <w:ind w:left="3600" w:hanging="360"/>
+      </w:pPr>
+      <w:rPr>
+        <w:rFonts w:ascii="Wingdings" w:hAnsi="Wingdings" w:hint="default"/>
+        <w:sz w:val="20"/>
+      </w:rPr>
+    </w:lvl>
+    <w:lvl w:ilvl="5" w:tentative="1">
+      <w:start w:val="1"/>
+      <w:numFmt w:val="bullet"/>
+      <w:lvlText w:val=""/>
+      <w:lvlJc w:val="left"/>
+      <w:pPr>
+        <w:tabs>
+          <w:tab w:val="num" w:pos="4320"/>
+        </w:tabs>
+        <w:ind w:left="4320" w:hanging="360"/>
+      </w:pPr>
+      <w:rPr>
+        <w:rFonts w:ascii="Wingdings" w:hAnsi="Wingdings" w:hint="default"/>
+        <w:sz w:val="20"/>
+      </w:rPr>
+    </w:lvl>
+    <w:lvl w:ilvl="6" w:tentative="1">
+      <w:start w:val="1"/>
+      <w:numFmt w:val="bullet"/>
+      <w:lvlText w:val=""/>
+      <w:lvlJc w:val="left"/>
+      <w:pPr>
+        <w:tabs>
+          <w:tab w:val="num" w:pos="5040"/>
+        </w:tabs>
+        <w:ind w:left="5040" w:hanging="360"/>
+      </w:pPr>
+      <w:rPr>
+        <w:rFonts w:ascii="Wingdings" w:hAnsi="Wingdings" w:hint="default"/>
+        <w:sz w:val="20"/>
+      </w:rPr>
+    </w:lvl>
+    <w:lvl w:ilvl="7" w:tentative="1">
+      <w:start w:val="1"/>
+      <w:numFmt w:val="bullet"/>
+      <w:lvlText w:val=""/>
+      <w:lvlJc w:val="left"/>
+      <w:pPr>
+        <w:tabs>
+          <w:tab w:val="num" w:pos="5760"/>
+        </w:tabs>
+        <w:ind w:left="5760" w:hanging="360"/>
+      </w:pPr>
+      <w:rPr>
+        <w:rFonts w:ascii="Wingdings" w:hAnsi="Wingdings" w:hint="default"/>
+        <w:sz w:val="20"/>
+      </w:rPr>
+    </w:lvl>
+    <w:lvl w:ilvl="8" w:tentative="1">
+      <w:start w:val="1"/>
+      <w:numFmt w:val="bullet"/>
+      <w:lvlText w:val=""/>
+      <w:lvlJc w:val="left"/>
+      <w:pPr>
+        <w:tabs>
+          <w:tab w:val="num" w:pos="6480"/>
+        </w:tabs>
+        <w:ind w:left="6480" w:hanging="360"/>
+      </w:pPr>
+      <w:rPr>
+        <w:rFonts w:ascii="Wingdings" w:hAnsi="Wingdings" w:hint="default"/>
+        <w:sz w:val="20"/>
+      </w:rPr>
+    </w:lvl>
+  </w:abstractNum>
   <w:num w:numId="1" w16cid:durableId="390813744">
-    <w:abstractNumId w:val="20"/>
+    <w:abstractNumId w:val="23"/>
   </w:num>
   <w:num w:numId="2" w16cid:durableId="7682853">
     <w:abstractNumId w:val="4"/>
   </w:num>
   <w:num w:numId="3" w16cid:durableId="808744836">
-    <w:abstractNumId w:val="8"/>
+    <w:abstractNumId w:val="9"/>
   </w:num>
   <w:num w:numId="4" w16cid:durableId="1253780249">
     <w:abstractNumId w:val="1"/>
   </w:num>
   <w:num w:numId="5" w16cid:durableId="310864051">
-    <w:abstractNumId w:val="9"/>
+    <w:abstractNumId w:val="10"/>
   </w:num>
   <w:num w:numId="6" w16cid:durableId="1650592532">
-    <w:abstractNumId w:val="15"/>
+    <w:abstractNumId w:val="17"/>
   </w:num>
   <w:num w:numId="7" w16cid:durableId="1081216183">
-    <w:abstractNumId w:val="7"/>
+    <w:abstractNumId w:val="8"/>
   </w:num>
   <w:num w:numId="8" w16cid:durableId="1780369603">
-    <w:abstractNumId w:val="19"/>
+    <w:abstractNumId w:val="22"/>
   </w:num>
   <w:num w:numId="9" w16cid:durableId="860045234">
-    <w:abstractNumId w:val="12"/>
+    <w:abstractNumId w:val="13"/>
   </w:num>
   <w:num w:numId="10" w16cid:durableId="1608345250">
-    <w:abstractNumId w:val="13"/>
+    <w:abstractNumId w:val="14"/>
   </w:num>
   <w:num w:numId="11" w16cid:durableId="497353597">
-    <w:abstractNumId w:val="17"/>
+    <w:abstractNumId w:val="20"/>
   </w:num>
   <w:num w:numId="12" w16cid:durableId="104471908">
-    <w:abstractNumId w:val="10"/>
+    <w:abstractNumId w:val="11"/>
   </w:num>
   <w:num w:numId="13" w16cid:durableId="1245140634">
-    <w:abstractNumId w:val="18"/>
+    <w:abstractNumId w:val="21"/>
   </w:num>
   <w:num w:numId="14" w16cid:durableId="702824424">
-    <w:abstractNumId w:val="16"/>
+    <w:abstractNumId w:val="19"/>
   </w:num>
   <w:num w:numId="15" w16cid:durableId="1435130066">
     <w:abstractNumId w:val="3"/>
   </w:num>
   <w:num w:numId="16" w16cid:durableId="782724952">
-    <w:abstractNumId w:val="11"/>
+    <w:abstractNumId w:val="12"/>
   </w:num>
   <w:num w:numId="17" w16cid:durableId="1422068458">
-    <w:abstractNumId w:val="23"/>
+    <w:abstractNumId w:val="27"/>
   </w:num>
   <w:num w:numId="18" w16cid:durableId="890582771">
-    <w:abstractNumId w:val="14"/>
+    <w:abstractNumId w:val="16"/>
   </w:num>
   <w:num w:numId="19" w16cid:durableId="778063593">
     <w:abstractNumId w:val="2"/>
@@ -26142,16 +29454,28 @@
     <w:abstractNumId w:val="0"/>
   </w:num>
   <w:num w:numId="21" w16cid:durableId="450322985">
+    <w:abstractNumId w:val="7"/>
+  </w:num>
+  <w:num w:numId="22" w16cid:durableId="1972978622">
     <w:abstractNumId w:val="6"/>
   </w:num>
-  <w:num w:numId="22" w16cid:durableId="1972978622">
+  <w:num w:numId="23" w16cid:durableId="452604473">
+    <w:abstractNumId w:val="24"/>
+  </w:num>
+  <w:num w:numId="24" w16cid:durableId="77168616">
+    <w:abstractNumId w:val="26"/>
+  </w:num>
+  <w:num w:numId="25" w16cid:durableId="717823599">
+    <w:abstractNumId w:val="25"/>
+  </w:num>
+  <w:num w:numId="26" w16cid:durableId="701856918">
+    <w:abstractNumId w:val="18"/>
+  </w:num>
+  <w:num w:numId="27" w16cid:durableId="1834487682">
     <w:abstractNumId w:val="5"/>
   </w:num>
-  <w:num w:numId="23" w16cid:durableId="452604473">
-    <w:abstractNumId w:val="21"/>
-  </w:num>
-  <w:num w:numId="24" w16cid:durableId="77168616">
-    <w:abstractNumId w:val="22"/>
+  <w:num w:numId="28" w16cid:durableId="239022994">
+    <w:abstractNumId w:val="15"/>
   </w:num>
 </w:numbering>
 </file>
@@ -27232,7 +30556,7 @@
 
 <file path=customXml/item1.xml><?xml version="1.0" encoding="utf-8"?>
 <CoverPageProperties xmlns="http://schemas.microsoft.com/office/2006/coverPageProps">
-  <PublishDate>7 de marzo de 2026</PublishDate>
+  <PublishDate>14 de marzo de 2026</PublishDate>
   <Abstract/>
   <CompanyAddress/>
   <CompanyPhone/>

</xml_diff>